<commit_message>
Aug 12th meeting notes updated with interested topic
</commit_message>
<xml_diff>
--- a/meetingNotes/12-08-2026.docx
+++ b/meetingNotes/12-08-2026.docx
@@ -1,6 +1,6 @@
 
 <file path=word/document.xml><?xml version="1.0" encoding="utf-8"?>
-<w:document xmlns:wpc="http://schemas.microsoft.com/office/word/2010/wordprocessingCanvas" xmlns:cx="http://schemas.microsoft.com/office/drawing/2014/chartex" xmlns:cx1="http://schemas.microsoft.com/office/drawing/2015/9/8/chartex" xmlns:cx2="http://schemas.microsoft.com/office/drawing/2015/10/21/chartex" xmlns:cx3="http://schemas.microsoft.com/office/drawing/2016/5/9/chartex" xmlns:cx4="http://schemas.microsoft.com/office/drawing/2016/5/10/chartex" xmlns:cx5="http://schemas.microsoft.com/office/drawing/2016/5/11/chartex" xmlns:cx6="http://schemas.microsoft.com/office/drawing/2016/5/12/chartex" xmlns:cx7="http://schemas.microsoft.com/office/drawing/2016/5/13/chartex" xmlns:cx8="http://schemas.microsoft.com/office/drawing/2016/5/14/chartex" xmlns:mc="http://schemas.openxmlformats.org/markup-compatibility/2006" xmlns:aink="http://schemas.microsoft.com/office/drawing/2016/ink" xmlns:am3d="http://schemas.microsoft.com/office/drawing/2017/model3d" xmlns:o="urn:schemas-microsoft-com:office:office" xmlns:oel="http://schemas.microsoft.com/office/2019/extlst" xmlns:r="http://schemas.openxmlformats.org/officeDocument/2006/relationships" xmlns:m="http://schemas.openxmlformats.org/officeDocument/2006/math" xmlns:v="urn:schemas-microsoft-com:vml" xmlns:wp14="http://schemas.microsoft.com/office/word/2010/wordprocessingDrawing" xmlns:wp="http://schemas.openxmlformats.org/drawingml/2006/wordprocessingDrawing" xmlns:w10="urn:schemas-microsoft-com:office:word" xmlns:w="http://schemas.openxmlformats.org/wordprocessingml/2006/main" xmlns:w14="http://schemas.microsoft.com/office/word/2010/wordml" xmlns:w15="http://schemas.microsoft.com/office/word/2012/wordml" xmlns:w16cex="http://schemas.microsoft.com/office/word/2018/wordml/cex" xmlns:w16cid="http://schemas.microsoft.com/office/word/2016/wordml/cid" xmlns:w16="http://schemas.microsoft.com/office/word/2018/wordml" xmlns:w16du="http://schemas.microsoft.com/office/word/2023/wordml/word16du" xmlns:w16sdtdh="http://schemas.microsoft.com/office/word/2020/wordml/sdtdatahash" xmlns:w16sdtfl="http://schemas.microsoft.com/office/word/2024/wordml/sdtformatlock" xmlns:w16se="http://schemas.microsoft.com/office/word/2015/wordml/symex" xmlns:wpg="http://schemas.microsoft.com/office/word/2010/wordprocessingGroup" xmlns:wpi="http://schemas.microsoft.com/office/word/2010/wordprocessingInk" xmlns:wne="http://schemas.microsoft.com/office/word/2006/wordml" xmlns:wps="http://schemas.microsoft.com/office/word/2010/wordprocessingShape" mc:Ignorable="w14 w15 w16se w16cid w16 w16cex w16sdtdh w16sdtfl w16du wp14">
+<w:document xmlns:wpc="http://schemas.microsoft.com/office/word/2010/wordprocessingCanvas" xmlns:cx="http://schemas.microsoft.com/office/drawing/2014/chartex" xmlns:cx1="http://schemas.microsoft.com/office/drawing/2015/9/8/chartex" xmlns:cx2="http://schemas.microsoft.com/office/drawing/2015/10/21/chartex" xmlns:cx3="http://schemas.microsoft.com/office/drawing/2016/5/9/chartex" xmlns:cx4="http://schemas.microsoft.com/office/drawing/2016/5/10/chartex" xmlns:cx5="http://schemas.microsoft.com/office/drawing/2016/5/11/chartex" xmlns:cx6="http://schemas.microsoft.com/office/drawing/2016/5/12/chartex" xmlns:cx7="http://schemas.microsoft.com/office/drawing/2016/5/13/chartex" xmlns:cx8="http://schemas.microsoft.com/office/drawing/2016/5/14/chartex" xmlns:mc="http://schemas.openxmlformats.org/markup-compatibility/2006" xmlns:m="http://schemas.openxmlformats.org/officeDocument/2006/math" xmlns:aink="http://schemas.microsoft.com/office/drawing/2016/ink" xmlns:am3d="http://schemas.microsoft.com/office/drawing/2017/model3d" xmlns:oel="http://schemas.microsoft.com/office/2019/extlst" xmlns:r="http://schemas.openxmlformats.org/officeDocument/2006/relationships" xmlns:wp14="http://schemas.microsoft.com/office/word/2010/wordprocessingDrawing" xmlns:wp="http://schemas.openxmlformats.org/drawingml/2006/wordprocessingDrawing" xmlns:wpg="http://schemas.microsoft.com/office/word/2010/wordprocessingGroup" xmlns:wpi="http://schemas.microsoft.com/office/word/2010/wordprocessingInk" xmlns:wps="http://schemas.microsoft.com/office/word/2010/wordprocessingShape" xmlns:o="urn:schemas-microsoft-com:office:office" xmlns:v="urn:schemas-microsoft-com:vml" xmlns:w10="urn:schemas-microsoft-com:office:word" xmlns:w="http://schemas.openxmlformats.org/wordprocessingml/2006/main" xmlns:w14="http://schemas.microsoft.com/office/word/2010/wordml" xmlns:w15="http://schemas.microsoft.com/office/word/2012/wordml" xmlns:w16cei="http://schemas.microsoft.com/office/word/2026/wordml/cei" xmlns:w16cex="http://schemas.microsoft.com/office/word/2018/wordml/cex" xmlns:w16cid="http://schemas.microsoft.com/office/word/2016/wordml/cid" xmlns:w16="http://schemas.microsoft.com/office/word/2018/wordml" xmlns:w16sdtdh="http://schemas.microsoft.com/office/word/2020/wordml/sdtdatahash" xmlns:w16sdtfl="http://schemas.microsoft.com/office/word/2024/wordml/sdtformatlock" xmlns:w16se="http://schemas.microsoft.com/office/word/2015/wordml/symex" xmlns:w16du="http://schemas.microsoft.com/office/word/2023/wordml/word16du" xmlns:wne="http://schemas.microsoft.com/office/word/2006/wordml" mc:Ignorable="w14 w15 w16se w16cid w16 w16cex w16sdtdh w16sdtfl w16du wp14">
   <w:body>
     <w:p>
       <w:pPr>
@@ -579,6 +579,7 @@
       </w:r>
     </w:p>
     <w:p>
+      <w:bookmarkStart w:id="6" w:name="_Hlk237370056"/>
       <w:r>
         <w:t>Secure Simulation Frameworks &amp; Datasets</w:t>
       </w:r>
@@ -591,8 +592,8 @@
           <w:numId w:val="6"/>
         </w:numPr>
       </w:pPr>
-      <w:commentRangeStart w:id="6"/>
       <w:commentRangeStart w:id="7"/>
+      <w:commentRangeStart w:id="8"/>
       <w:r>
         <w:t>Extending ROS 2 UAV simulators (PX4 + Gazebo/Ignition) with attack injection and full telemetry logging</w:t>
       </w:r>
@@ -608,34 +609,91 @@
       <w:r>
         <w:t>Public intrusion-detection datasets for ROS 2 UAVs with labeled attack/normal phases</w:t>
       </w:r>
-      <w:commentRangeEnd w:id="6"/>
+      <w:commentRangeEnd w:id="7"/>
       <w:r>
         <w:rPr>
           <w:rStyle w:val="CommentReference"/>
           <w:sz w:val="24"/>
           <w:szCs w:val="24"/>
         </w:rPr>
-        <w:commentReference w:id="6"/>
-      </w:r>
-      <w:commentRangeEnd w:id="7"/>
+        <w:commentReference w:id="7"/>
+      </w:r>
+      <w:commentRangeEnd w:id="8"/>
       <w:r>
         <w:rPr>
           <w:rStyle w:val="CommentReference"/>
           <w:sz w:val="24"/>
           <w:szCs w:val="24"/>
         </w:rPr>
-        <w:commentReference w:id="7"/>
-      </w:r>
-    </w:p>
-    <w:p>
-      <w:pPr>
-        <w:rPr>
-          <w:b/>
-          <w:bCs/>
-          <w:sz w:val="28"/>
-          <w:szCs w:val="28"/>
-        </w:rPr>
-      </w:pPr>
+        <w:commentReference w:id="8"/>
+      </w:r>
+    </w:p>
+    <w:bookmarkEnd w:id="6"/>
+    <w:p>
+      <w:r>
+        <w:t>Metadata in SROS</w:t>
+      </w:r>
+      <w:bookmarkStart w:id="9" w:name="_Hlk237370109"/>
+    </w:p>
+    <w:bookmarkEnd w:id="9"/>
+    <w:p>
+      <w:pPr>
+        <w:pStyle w:val="ListParagraph"/>
+        <w:numPr>
+          <w:ilvl w:val="0"/>
+          <w:numId w:val="6"/>
+        </w:numPr>
+      </w:pPr>
+      <w:commentRangeStart w:id="10"/>
+      <w:commentRangeStart w:id="11"/>
+      <w:r>
+        <w:t>Behavioral leakage in correctly-configured SROS2</w:t>
+      </w:r>
+      <w:commentRangeEnd w:id="10"/>
+      <w:r>
+        <w:rPr>
+          <w:rStyle w:val="CommentReference"/>
+          <w:sz w:val="24"/>
+          <w:szCs w:val="24"/>
+        </w:rPr>
+        <w:commentReference w:id="10"/>
+      </w:r>
+      <w:commentRangeEnd w:id="11"/>
+      <w:r>
+        <w:rPr>
+          <w:rStyle w:val="CommentReference"/>
+          <w:sz w:val="24"/>
+          <w:szCs w:val="24"/>
+        </w:rPr>
+        <w:commentReference w:id="11"/>
+      </w:r>
+    </w:p>
+    <w:p>
+      <w:r>
+        <w:t>ROS 2 Security</w:t>
+      </w:r>
+    </w:p>
+    <w:p>
+      <w:pPr>
+        <w:pStyle w:val="ListParagraph"/>
+        <w:numPr>
+          <w:ilvl w:val="0"/>
+          <w:numId w:val="6"/>
+        </w:numPr>
+      </w:pPr>
+      <w:commentRangeStart w:id="12"/>
+      <w:r>
+        <w:t>Safety-invariant violation on manipulators via world-model poisoning</w:t>
+      </w:r>
+      <w:commentRangeEnd w:id="12"/>
+      <w:r>
+        <w:rPr>
+          <w:rStyle w:val="CommentReference"/>
+          <w:sz w:val="24"/>
+          <w:szCs w:val="24"/>
+        </w:rPr>
+        <w:commentReference w:id="12"/>
+      </w:r>
     </w:p>
     <w:sectPr>
       <w:pgSz w:w="12240" w:h="15840"/>
@@ -648,7 +706,7 @@
 </file>
 
 <file path=word/comments.xml><?xml version="1.0" encoding="utf-8"?>
-<w:comments xmlns:wpc="http://schemas.microsoft.com/office/word/2010/wordprocessingCanvas" xmlns:cx="http://schemas.microsoft.com/office/drawing/2014/chartex" xmlns:cx1="http://schemas.microsoft.com/office/drawing/2015/9/8/chartex" xmlns:cx2="http://schemas.microsoft.com/office/drawing/2015/10/21/chartex" xmlns:cx3="http://schemas.microsoft.com/office/drawing/2016/5/9/chartex" xmlns:cx4="http://schemas.microsoft.com/office/drawing/2016/5/10/chartex" xmlns:cx5="http://schemas.microsoft.com/office/drawing/2016/5/11/chartex" xmlns:cx6="http://schemas.microsoft.com/office/drawing/2016/5/12/chartex" xmlns:cx7="http://schemas.microsoft.com/office/drawing/2016/5/13/chartex" xmlns:cx8="http://schemas.microsoft.com/office/drawing/2016/5/14/chartex" xmlns:mc="http://schemas.openxmlformats.org/markup-compatibility/2006" xmlns:aink="http://schemas.microsoft.com/office/drawing/2016/ink" xmlns:am3d="http://schemas.microsoft.com/office/drawing/2017/model3d" xmlns:o="urn:schemas-microsoft-com:office:office" xmlns:oel="http://schemas.microsoft.com/office/2019/extlst" xmlns:r="http://schemas.openxmlformats.org/officeDocument/2006/relationships" xmlns:m="http://schemas.openxmlformats.org/officeDocument/2006/math" xmlns:v="urn:schemas-microsoft-com:vml" xmlns:wp14="http://schemas.microsoft.com/office/word/2010/wordprocessingDrawing" xmlns:wp="http://schemas.openxmlformats.org/drawingml/2006/wordprocessingDrawing" xmlns:w10="urn:schemas-microsoft-com:office:word" xmlns:w="http://schemas.openxmlformats.org/wordprocessingml/2006/main" xmlns:w14="http://schemas.microsoft.com/office/word/2010/wordml" xmlns:w15="http://schemas.microsoft.com/office/word/2012/wordml" xmlns:w16cex="http://schemas.microsoft.com/office/word/2018/wordml/cex" xmlns:w16cid="http://schemas.microsoft.com/office/word/2016/wordml/cid" xmlns:w16="http://schemas.microsoft.com/office/word/2018/wordml" xmlns:w16du="http://schemas.microsoft.com/office/word/2023/wordml/word16du" xmlns:w16sdtdh="http://schemas.microsoft.com/office/word/2020/wordml/sdtdatahash" xmlns:w16sdtfl="http://schemas.microsoft.com/office/word/2024/wordml/sdtformatlock" xmlns:w16se="http://schemas.microsoft.com/office/word/2015/wordml/symex" xmlns:wpg="http://schemas.microsoft.com/office/word/2010/wordprocessingGroup" xmlns:wpi="http://schemas.microsoft.com/office/word/2010/wordprocessingInk" xmlns:wne="http://schemas.microsoft.com/office/word/2006/wordml" xmlns:wps="http://schemas.microsoft.com/office/word/2010/wordprocessingShape" mc:Ignorable="w14 w15 w16se w16cid w16 w16cex w16sdtdh w16sdtfl w16du wp14">
+<w:comments xmlns:wpc="http://schemas.microsoft.com/office/word/2010/wordprocessingCanvas" xmlns:cx="http://schemas.microsoft.com/office/drawing/2014/chartex" xmlns:cx1="http://schemas.microsoft.com/office/drawing/2015/9/8/chartex" xmlns:cx2="http://schemas.microsoft.com/office/drawing/2015/10/21/chartex" xmlns:cx3="http://schemas.microsoft.com/office/drawing/2016/5/9/chartex" xmlns:cx4="http://schemas.microsoft.com/office/drawing/2016/5/10/chartex" xmlns:cx5="http://schemas.microsoft.com/office/drawing/2016/5/11/chartex" xmlns:cx6="http://schemas.microsoft.com/office/drawing/2016/5/12/chartex" xmlns:cx7="http://schemas.microsoft.com/office/drawing/2016/5/13/chartex" xmlns:cx8="http://schemas.microsoft.com/office/drawing/2016/5/14/chartex" xmlns:mc="http://schemas.openxmlformats.org/markup-compatibility/2006" xmlns:m="http://schemas.openxmlformats.org/officeDocument/2006/math" xmlns:aink="http://schemas.microsoft.com/office/drawing/2016/ink" xmlns:am3d="http://schemas.microsoft.com/office/drawing/2017/model3d" xmlns:oel="http://schemas.microsoft.com/office/2019/extlst" xmlns:r="http://schemas.openxmlformats.org/officeDocument/2006/relationships" xmlns:wp14="http://schemas.microsoft.com/office/word/2010/wordprocessingDrawing" xmlns:wp="http://schemas.openxmlformats.org/drawingml/2006/wordprocessingDrawing" xmlns:wpg="http://schemas.microsoft.com/office/word/2010/wordprocessingGroup" xmlns:wpi="http://schemas.microsoft.com/office/word/2010/wordprocessingInk" xmlns:wps="http://schemas.microsoft.com/office/word/2010/wordprocessingShape" xmlns:o="urn:schemas-microsoft-com:office:office" xmlns:v="urn:schemas-microsoft-com:vml" xmlns:w10="urn:schemas-microsoft-com:office:word" xmlns:w="http://schemas.openxmlformats.org/wordprocessingml/2006/main" xmlns:w14="http://schemas.microsoft.com/office/word/2010/wordml" xmlns:w15="http://schemas.microsoft.com/office/word/2012/wordml" xmlns:w16cei="http://schemas.microsoft.com/office/word/2026/wordml/cei" xmlns:w16cex="http://schemas.microsoft.com/office/word/2018/wordml/cex" xmlns:w16cid="http://schemas.microsoft.com/office/word/2016/wordml/cid" xmlns:w16="http://schemas.microsoft.com/office/word/2018/wordml" xmlns:w16sdtdh="http://schemas.microsoft.com/office/word/2020/wordml/sdtdatahash" xmlns:w16sdtfl="http://schemas.microsoft.com/office/word/2024/wordml/sdtformatlock" xmlns:w16se="http://schemas.microsoft.com/office/word/2015/wordml/symex" xmlns:w16du="http://schemas.microsoft.com/office/word/2023/wordml/word16du" xmlns:wne="http://schemas.microsoft.com/office/word/2006/wordml" mc:Ignorable="w14 w15 w16se w16cid w16 w16cex w16sdtdh w16sdtfl w16du wp14">
   <w:comment w:id="0" w:author="Liam Degand" w:date="2026-08-12T10:51:00Z" w:initials="LD">
     <w:p>
       <w:pPr>
@@ -824,7 +882,7 @@
       </w:r>
     </w:p>
   </w:comment>
-  <w:comment w:id="6" w:author="Liam Degand" w:date="2026-08-12T11:11:00Z" w:initials="LD">
+  <w:comment w:id="7" w:author="Liam Degand" w:date="2026-08-12T11:11:00Z" w:initials="LD">
     <w:p>
       <w:pPr>
         <w:pStyle w:val="CommentText"/>
@@ -840,7 +898,7 @@
       </w:r>
     </w:p>
   </w:comment>
-  <w:comment w:id="7" w:author="Liam Degand" w:date="2026-08-12T11:11:00Z" w:initials="LD">
+  <w:comment w:id="8" w:author="Liam Degand" w:date="2026-08-12T11:11:00Z" w:initials="LD">
     <w:p>
       <w:pPr>
         <w:pStyle w:val="CommentText"/>
@@ -982,11 +1040,90 @@
       </w:r>
     </w:p>
   </w:comment>
+  <w:comment w:id="10" w:author="Sung-Yu Lin" w:date="2026-08-11T19:51:00Z" w:initials="SYL">
+    <w:p>
+      <w:r>
+        <w:rPr>
+          <w:rStyle w:val="CommentReference"/>
+        </w:rPr>
+        <w:annotationRef/>
+      </w:r>
+      <w:r>
+        <w:rPr>
+          <w:sz w:val="20"/>
+          <w:szCs w:val="20"/>
+        </w:rPr>
+        <w:t>SPDP can't be encrypted. Targeting robotic fleet.</w:t>
+      </w:r>
+    </w:p>
+    <w:p/>
+    <w:p>
+      <w:r>
+        <w:rPr>
+          <w:sz w:val="20"/>
+          <w:szCs w:val="20"/>
+        </w:rPr>
+        <w:t>1. GUID prefix</w:t>
+      </w:r>
+    </w:p>
+    <w:p>
+      <w:r>
+        <w:rPr>
+          <w:sz w:val="20"/>
+          <w:szCs w:val="20"/>
+        </w:rPr>
+        <w:t>2. Unicast and multicast locators 3. Vendor ID and protocol version 4. The identity token</w:t>
+      </w:r>
+    </w:p>
+    <w:p>
+      <w:r>
+        <w:rPr>
+          <w:sz w:val="20"/>
+          <w:szCs w:val="20"/>
+        </w:rPr>
+        <w:t>5. Lease duration and liveliness state</w:t>
+      </w:r>
+    </w:p>
+  </w:comment>
+  <w:comment w:id="11" w:author="Sung-Yu Lin" w:date="2026-08-11T20:09:00Z" w:initials="SYL">
+    <w:p>
+      <w:r>
+        <w:rPr>
+          <w:rStyle w:val="CommentReference"/>
+        </w:rPr>
+        <w:annotationRef/>
+      </w:r>
+      <w:r>
+        <w:rPr>
+          <w:sz w:val="20"/>
+          <w:szCs w:val="20"/>
+        </w:rPr>
+        <w:t>Cyber-physical inference, mapping traffic features to physical state and safety consequence.</w:t>
+      </w:r>
+    </w:p>
+  </w:comment>
+  <w:comment w:id="12" w:author="Sung-Yu Lin" w:date="2026-08-11T20:36:00Z" w:initials="SYL">
+    <w:p>
+      <w:r>
+        <w:rPr>
+          <w:rStyle w:val="CommentReference"/>
+        </w:rPr>
+        <w:annotationRef/>
+      </w:r>
+      <w:r>
+        <w:rPr>
+          <w:sz w:val="20"/>
+          <w:szCs w:val="20"/>
+        </w:rPr>
+        <w:t>Control theory. False data injection against state estimation is mature (Mo, Garone, Casavola, Sinopoli, CDC 2010), including a sub-literature on stealthy attacks staying under residual-detector thresholds. "Minimal perturbation that flips a safety decision" is, in that vocabulary, a solved formulation.</w:t>
+      </w:r>
+    </w:p>
+  </w:comment>
 </w:comments>
 </file>
 
 <file path=word/commentsExtended.xml><?xml version="1.0" encoding="utf-8"?>
-<w15:commentsEx xmlns:wpc="http://schemas.microsoft.com/office/word/2010/wordprocessingCanvas" xmlns:cx="http://schemas.microsoft.com/office/drawing/2014/chartex" xmlns:cx1="http://schemas.microsoft.com/office/drawing/2015/9/8/chartex" xmlns:cx2="http://schemas.microsoft.com/office/drawing/2015/10/21/chartex" xmlns:cx3="http://schemas.microsoft.com/office/drawing/2016/5/9/chartex" xmlns:cx4="http://schemas.microsoft.com/office/drawing/2016/5/10/chartex" xmlns:cx5="http://schemas.microsoft.com/office/drawing/2016/5/11/chartex" xmlns:cx6="http://schemas.microsoft.com/office/drawing/2016/5/12/chartex" xmlns:cx7="http://schemas.microsoft.com/office/drawing/2016/5/13/chartex" xmlns:cx8="http://schemas.microsoft.com/office/drawing/2016/5/14/chartex" xmlns:mc="http://schemas.openxmlformats.org/markup-compatibility/2006" xmlns:aink="http://schemas.microsoft.com/office/drawing/2016/ink" xmlns:am3d="http://schemas.microsoft.com/office/drawing/2017/model3d" xmlns:o="urn:schemas-microsoft-com:office:office" xmlns:oel="http://schemas.microsoft.com/office/2019/extlst" xmlns:r="http://schemas.openxmlformats.org/officeDocument/2006/relationships" xmlns:m="http://schemas.openxmlformats.org/officeDocument/2006/math" xmlns:v="urn:schemas-microsoft-com:vml" xmlns:wp14="http://schemas.microsoft.com/office/word/2010/wordprocessingDrawing" xmlns:wp="http://schemas.openxmlformats.org/drawingml/2006/wordprocessingDrawing" xmlns:w10="urn:schemas-microsoft-com:office:word" xmlns:w="http://schemas.openxmlformats.org/wordprocessingml/2006/main" xmlns:w14="http://schemas.microsoft.com/office/word/2010/wordml" xmlns:w15="http://schemas.microsoft.com/office/word/2012/wordml" xmlns:w16cex="http://schemas.microsoft.com/office/word/2018/wordml/cex" xmlns:w16cid="http://schemas.microsoft.com/office/word/2016/wordml/cid" xmlns:w16="http://schemas.microsoft.com/office/word/2018/wordml" xmlns:w16du="http://schemas.microsoft.com/office/word/2023/wordml/word16du" xmlns:w16sdtdh="http://schemas.microsoft.com/office/word/2020/wordml/sdtdatahash" xmlns:w16sdtfl="http://schemas.microsoft.com/office/word/2024/wordml/sdtformatlock" xmlns:w16se="http://schemas.microsoft.com/office/word/2015/wordml/symex" xmlns:wpg="http://schemas.microsoft.com/office/word/2010/wordprocessingGroup" xmlns:wpi="http://schemas.microsoft.com/office/word/2010/wordprocessingInk" xmlns:wne="http://schemas.microsoft.com/office/word/2006/wordml" xmlns:wps="http://schemas.microsoft.com/office/word/2010/wordprocessingShape" mc:Ignorable="w14 w15 w16se w16cid w16 w16cex w16sdtdh w16sdtfl w16du wp14">
+<w15:commentsEx xmlns:wpc="http://schemas.microsoft.com/office/word/2010/wordprocessingCanvas" xmlns:cx="http://schemas.microsoft.com/office/drawing/2014/chartex" xmlns:cx1="http://schemas.microsoft.com/office/drawing/2015/9/8/chartex" xmlns:cx2="http://schemas.microsoft.com/office/drawing/2015/10/21/chartex" xmlns:cx3="http://schemas.microsoft.com/office/drawing/2016/5/9/chartex" xmlns:cx4="http://schemas.microsoft.com/office/drawing/2016/5/10/chartex" xmlns:cx5="http://schemas.microsoft.com/office/drawing/2016/5/11/chartex" xmlns:cx6="http://schemas.microsoft.com/office/drawing/2016/5/12/chartex" xmlns:cx7="http://schemas.microsoft.com/office/drawing/2016/5/13/chartex" xmlns:cx8="http://schemas.microsoft.com/office/drawing/2016/5/14/chartex" xmlns:mc="http://schemas.openxmlformats.org/markup-compatibility/2006" xmlns:m="http://schemas.openxmlformats.org/officeDocument/2006/math" xmlns:aink="http://schemas.microsoft.com/office/drawing/2016/ink" xmlns:am3d="http://schemas.microsoft.com/office/drawing/2017/model3d" xmlns:oel="http://schemas.microsoft.com/office/2019/extlst" xmlns:r="http://schemas.openxmlformats.org/officeDocument/2006/relationships" xmlns:wp14="http://schemas.microsoft.com/office/word/2010/wordprocessingDrawing" xmlns:wp="http://schemas.openxmlformats.org/drawingml/2006/wordprocessingDrawing" xmlns:wpg="http://schemas.microsoft.com/office/word/2010/wordprocessingGroup" xmlns:wpi="http://schemas.microsoft.com/office/word/2010/wordprocessingInk" xmlns:wps="http://schemas.microsoft.com/office/word/2010/wordprocessingShape" xmlns:o="urn:schemas-microsoft-com:office:office" xmlns:v="urn:schemas-microsoft-com:vml" xmlns:w10="urn:schemas-microsoft-com:office:word" xmlns:w="http://schemas.openxmlformats.org/wordprocessingml/2006/main" xmlns:w14="http://schemas.microsoft.com/office/word/2010/wordml" xmlns:w15="http://schemas.microsoft.com/office/word/2012/wordml" xmlns:w16cei="http://schemas.microsoft.com/office/word/2026/wordml/cei" xmlns:w16cex="http://schemas.microsoft.com/office/word/2018/wordml/cex" xmlns:w16cid="http://schemas.microsoft.com/office/word/2016/wordml/cid" xmlns:w16="http://schemas.microsoft.com/office/word/2018/wordml" xmlns:w16sdtdh="http://schemas.microsoft.com/office/word/2020/wordml/sdtdatahash" xmlns:w16sdtfl="http://schemas.microsoft.com/office/word/2024/wordml/sdtformatlock" xmlns:w16se="http://schemas.microsoft.com/office/word/2015/wordml/symex" xmlns:w16du="http://schemas.microsoft.com/office/word/2023/wordml/word16du" xmlns:wne="http://schemas.microsoft.com/office/word/2006/wordml" mc:Ignorable="w14 w15 w16se w16cid w16 w16cex w16sdtdh w16sdtfl w16du wp14">
   <w15:commentEx w15:paraId="6A349BC9" w15:done="0"/>
   <w15:commentEx w15:paraId="0ED81B75" w15:paraIdParent="6A349BC9" w15:done="0"/>
   <w15:commentEx w15:paraId="763FAF6B" w15:paraIdParent="6A349BC9" w15:done="0"/>
@@ -995,11 +1132,14 @@
   <w15:commentEx w15:paraId="4B8ADC60" w15:paraIdParent="6A349BC9" w15:done="0"/>
   <w15:commentEx w15:paraId="23BFEBAB" w15:done="0"/>
   <w15:commentEx w15:paraId="7A5B5686" w15:paraIdParent="23BFEBAB" w15:done="0"/>
+  <w15:commentEx w15:paraId="7A22DF8A" w15:done="0"/>
+  <w15:commentEx w15:paraId="36AAE7A0" w15:paraIdParent="7A22DF8A" w15:done="0"/>
+  <w15:commentEx w15:paraId="1E52ED40" w15:done="0"/>
 </w15:commentsEx>
 </file>
 
 <file path=word/commentsExtensible.xml><?xml version="1.0" encoding="utf-8"?>
-<w16cex:commentsExtensible xmlns:wpc="http://schemas.microsoft.com/office/word/2010/wordprocessingCanvas" xmlns:cx="http://schemas.microsoft.com/office/drawing/2014/chartex" xmlns:cx1="http://schemas.microsoft.com/office/drawing/2015/9/8/chartex" xmlns:cx2="http://schemas.microsoft.com/office/drawing/2015/10/21/chartex" xmlns:cx3="http://schemas.microsoft.com/office/drawing/2016/5/9/chartex" xmlns:cx4="http://schemas.microsoft.com/office/drawing/2016/5/10/chartex" xmlns:cx5="http://schemas.microsoft.com/office/drawing/2016/5/11/chartex" xmlns:cx6="http://schemas.microsoft.com/office/drawing/2016/5/12/chartex" xmlns:cx7="http://schemas.microsoft.com/office/drawing/2016/5/13/chartex" xmlns:cx8="http://schemas.microsoft.com/office/drawing/2016/5/14/chartex" xmlns:cr="http://schemas.microsoft.com/office/comments/2020/reactions" xmlns:mc="http://schemas.openxmlformats.org/markup-compatibility/2006" xmlns:aink="http://schemas.microsoft.com/office/drawing/2016/ink" xmlns:am3d="http://schemas.microsoft.com/office/drawing/2017/model3d" xmlns:o="urn:schemas-microsoft-com:office:office" xmlns:oel="http://schemas.microsoft.com/office/2019/extlst" xmlns:r="http://schemas.openxmlformats.org/officeDocument/2006/relationships" xmlns:m="http://schemas.openxmlformats.org/officeDocument/2006/math" xmlns:v="urn:schemas-microsoft-com:vml" xmlns:wp14="http://schemas.microsoft.com/office/word/2010/wordprocessingDrawing" xmlns:wp="http://schemas.openxmlformats.org/drawingml/2006/wordprocessingDrawing" xmlns:w10="urn:schemas-microsoft-com:office:word" xmlns:w="http://schemas.openxmlformats.org/wordprocessingml/2006/main" xmlns:w14="http://schemas.microsoft.com/office/word/2010/wordml" xmlns:w15="http://schemas.microsoft.com/office/word/2012/wordml" xmlns:w16cex="http://schemas.microsoft.com/office/word/2018/wordml/cex" xmlns:w16cid="http://schemas.microsoft.com/office/word/2016/wordml/cid" xmlns:w16="http://schemas.microsoft.com/office/word/2018/wordml" xmlns:w16du="http://schemas.microsoft.com/office/word/2023/wordml/word16du" xmlns:w16sdtdh="http://schemas.microsoft.com/office/word/2020/wordml/sdtdatahash" xmlns:w16sdtfl="http://schemas.microsoft.com/office/word/2024/wordml/sdtformatlock" xmlns:w16se="http://schemas.microsoft.com/office/word/2015/wordml/symex" xmlns:wpg="http://schemas.microsoft.com/office/word/2010/wordprocessingGroup" xmlns:wpi="http://schemas.microsoft.com/office/word/2010/wordprocessingInk" xmlns:wne="http://schemas.microsoft.com/office/word/2006/wordml" xmlns:wps="http://schemas.microsoft.com/office/word/2010/wordprocessingShape" mc:Ignorable="w14 w15 w16se w16cid w16 w16cex w16sdtdh w16sdtfl cr w16du wp14">
+<w16cex:commentsExtensible xmlns:wpc="http://schemas.microsoft.com/office/word/2010/wordprocessingCanvas" xmlns:cx="http://schemas.microsoft.com/office/drawing/2014/chartex" xmlns:cx1="http://schemas.microsoft.com/office/drawing/2015/9/8/chartex" xmlns:cx2="http://schemas.microsoft.com/office/drawing/2015/10/21/chartex" xmlns:cx3="http://schemas.microsoft.com/office/drawing/2016/5/9/chartex" xmlns:cx4="http://schemas.microsoft.com/office/drawing/2016/5/10/chartex" xmlns:cx5="http://schemas.microsoft.com/office/drawing/2016/5/11/chartex" xmlns:cx6="http://schemas.microsoft.com/office/drawing/2016/5/12/chartex" xmlns:cx7="http://schemas.microsoft.com/office/drawing/2016/5/13/chartex" xmlns:cx8="http://schemas.microsoft.com/office/drawing/2016/5/14/chartex" xmlns:cr="http://schemas.microsoft.com/office/comments/2020/reactions" xmlns:mc="http://schemas.openxmlformats.org/markup-compatibility/2006" xmlns:m="http://schemas.openxmlformats.org/officeDocument/2006/math" xmlns:aink="http://schemas.microsoft.com/office/drawing/2016/ink" xmlns:am3d="http://schemas.microsoft.com/office/drawing/2017/model3d" xmlns:oel="http://schemas.microsoft.com/office/2019/extlst" xmlns:r="http://schemas.openxmlformats.org/officeDocument/2006/relationships" xmlns:wp14="http://schemas.microsoft.com/office/word/2010/wordprocessingDrawing" xmlns:wp="http://schemas.openxmlformats.org/drawingml/2006/wordprocessingDrawing" xmlns:wpg="http://schemas.microsoft.com/office/word/2010/wordprocessingGroup" xmlns:wpi="http://schemas.microsoft.com/office/word/2010/wordprocessingInk" xmlns:wps="http://schemas.microsoft.com/office/word/2010/wordprocessingShape" xmlns:o="urn:schemas-microsoft-com:office:office" xmlns:v="urn:schemas-microsoft-com:vml" xmlns:w10="urn:schemas-microsoft-com:office:word" xmlns:w="http://schemas.openxmlformats.org/wordprocessingml/2006/main" xmlns:w14="http://schemas.microsoft.com/office/word/2010/wordml" xmlns:w15="http://schemas.microsoft.com/office/word/2012/wordml" xmlns:w16cei="http://schemas.microsoft.com/office/word/2026/wordml/cei" xmlns:w16cex="http://schemas.microsoft.com/office/word/2018/wordml/cex" xmlns:w16cid="http://schemas.microsoft.com/office/word/2016/wordml/cid" xmlns:w16="http://schemas.microsoft.com/office/word/2018/wordml" xmlns:w16sdtdh="http://schemas.microsoft.com/office/word/2020/wordml/sdtdatahash" xmlns:w16sdtfl="http://schemas.microsoft.com/office/word/2024/wordml/sdtformatlock" xmlns:w16se="http://schemas.microsoft.com/office/word/2015/wordml/symex" xmlns:w16du="http://schemas.microsoft.com/office/word/2023/wordml/word16du" xmlns:wne="http://schemas.microsoft.com/office/word/2006/wordml" mc:Ignorable="w14 w15 w16se w16cid w16 w16cex w16sdtdh w16sdtfl cr w16du wp14">
   <w16cex:commentExtensible w16cex:durableId="5C7A62BB" w16cex:dateUtc="2026-08-12T00:51:00Z"/>
   <w16cex:commentExtensible w16cex:durableId="28EADEDC" w16cex:dateUtc="2026-08-12T00:53:00Z"/>
   <w16cex:commentExtensible w16cex:durableId="3201A5F4" w16cex:dateUtc="2026-08-12T00:58:00Z"/>
@@ -1008,11 +1148,14 @@
   <w16cex:commentExtensible w16cex:durableId="4C49AE1E" w16cex:dateUtc="2026-08-12T01:07:00Z"/>
   <w16cex:commentExtensible w16cex:durableId="366EC05D" w16cex:dateUtc="2026-08-12T01:11:00Z"/>
   <w16cex:commentExtensible w16cex:durableId="22E3770A" w16cex:dateUtc="2026-08-12T01:11:00Z"/>
+  <w16cex:commentExtensible w16cex:durableId="62E2D218" w16cex:dateUtc="2026-08-12T02:51:00Z"/>
+  <w16cex:commentExtensible w16cex:durableId="4B332354" w16cex:dateUtc="2026-08-12T03:09:00Z"/>
+  <w16cex:commentExtensible w16cex:durableId="6DCCDFDD" w16cex:dateUtc="2026-08-12T03:36:00Z"/>
 </w16cex:commentsExtensible>
 </file>
 
 <file path=word/commentsIds.xml><?xml version="1.0" encoding="utf-8"?>
-<w16cid:commentsIds xmlns:wpc="http://schemas.microsoft.com/office/word/2010/wordprocessingCanvas" xmlns:cx="http://schemas.microsoft.com/office/drawing/2014/chartex" xmlns:cx1="http://schemas.microsoft.com/office/drawing/2015/9/8/chartex" xmlns:cx2="http://schemas.microsoft.com/office/drawing/2015/10/21/chartex" xmlns:cx3="http://schemas.microsoft.com/office/drawing/2016/5/9/chartex" xmlns:cx4="http://schemas.microsoft.com/office/drawing/2016/5/10/chartex" xmlns:cx5="http://schemas.microsoft.com/office/drawing/2016/5/11/chartex" xmlns:cx6="http://schemas.microsoft.com/office/drawing/2016/5/12/chartex" xmlns:cx7="http://schemas.microsoft.com/office/drawing/2016/5/13/chartex" xmlns:cx8="http://schemas.microsoft.com/office/drawing/2016/5/14/chartex" xmlns:mc="http://schemas.openxmlformats.org/markup-compatibility/2006" xmlns:aink="http://schemas.microsoft.com/office/drawing/2016/ink" xmlns:am3d="http://schemas.microsoft.com/office/drawing/2017/model3d" xmlns:o="urn:schemas-microsoft-com:office:office" xmlns:oel="http://schemas.microsoft.com/office/2019/extlst" xmlns:r="http://schemas.openxmlformats.org/officeDocument/2006/relationships" xmlns:m="http://schemas.openxmlformats.org/officeDocument/2006/math" xmlns:v="urn:schemas-microsoft-com:vml" xmlns:wp14="http://schemas.microsoft.com/office/word/2010/wordprocessingDrawing" xmlns:wp="http://schemas.openxmlformats.org/drawingml/2006/wordprocessingDrawing" xmlns:w10="urn:schemas-microsoft-com:office:word" xmlns:w="http://schemas.openxmlformats.org/wordprocessingml/2006/main" xmlns:w14="http://schemas.microsoft.com/office/word/2010/wordml" xmlns:w15="http://schemas.microsoft.com/office/word/2012/wordml" xmlns:w16cex="http://schemas.microsoft.com/office/word/2018/wordml/cex" xmlns:w16cid="http://schemas.microsoft.com/office/word/2016/wordml/cid" xmlns:w16="http://schemas.microsoft.com/office/word/2018/wordml" xmlns:w16du="http://schemas.microsoft.com/office/word/2023/wordml/word16du" xmlns:w16sdtdh="http://schemas.microsoft.com/office/word/2020/wordml/sdtdatahash" xmlns:w16sdtfl="http://schemas.microsoft.com/office/word/2024/wordml/sdtformatlock" xmlns:w16se="http://schemas.microsoft.com/office/word/2015/wordml/symex" xmlns:wpg="http://schemas.microsoft.com/office/word/2010/wordprocessingGroup" xmlns:wpi="http://schemas.microsoft.com/office/word/2010/wordprocessingInk" xmlns:wne="http://schemas.microsoft.com/office/word/2006/wordml" xmlns:wps="http://schemas.microsoft.com/office/word/2010/wordprocessingShape" mc:Ignorable="w14 w15 w16se w16cid w16 w16cex w16sdtdh w16sdtfl w16du wp14">
+<w16cid:commentsIds xmlns:wpc="http://schemas.microsoft.com/office/word/2010/wordprocessingCanvas" xmlns:cx="http://schemas.microsoft.com/office/drawing/2014/chartex" xmlns:cx1="http://schemas.microsoft.com/office/drawing/2015/9/8/chartex" xmlns:cx2="http://schemas.microsoft.com/office/drawing/2015/10/21/chartex" xmlns:cx3="http://schemas.microsoft.com/office/drawing/2016/5/9/chartex" xmlns:cx4="http://schemas.microsoft.com/office/drawing/2016/5/10/chartex" xmlns:cx5="http://schemas.microsoft.com/office/drawing/2016/5/11/chartex" xmlns:cx6="http://schemas.microsoft.com/office/drawing/2016/5/12/chartex" xmlns:cx7="http://schemas.microsoft.com/office/drawing/2016/5/13/chartex" xmlns:cx8="http://schemas.microsoft.com/office/drawing/2016/5/14/chartex" xmlns:mc="http://schemas.openxmlformats.org/markup-compatibility/2006" xmlns:m="http://schemas.openxmlformats.org/officeDocument/2006/math" xmlns:aink="http://schemas.microsoft.com/office/drawing/2016/ink" xmlns:am3d="http://schemas.microsoft.com/office/drawing/2017/model3d" xmlns:oel="http://schemas.microsoft.com/office/2019/extlst" xmlns:r="http://schemas.openxmlformats.org/officeDocument/2006/relationships" xmlns:wp14="http://schemas.microsoft.com/office/word/2010/wordprocessingDrawing" xmlns:wp="http://schemas.openxmlformats.org/drawingml/2006/wordprocessingDrawing" xmlns:wpg="http://schemas.microsoft.com/office/word/2010/wordprocessingGroup" xmlns:wpi="http://schemas.microsoft.com/office/word/2010/wordprocessingInk" xmlns:wps="http://schemas.microsoft.com/office/word/2010/wordprocessingShape" xmlns:o="urn:schemas-microsoft-com:office:office" xmlns:v="urn:schemas-microsoft-com:vml" xmlns:w10="urn:schemas-microsoft-com:office:word" xmlns:w="http://schemas.openxmlformats.org/wordprocessingml/2006/main" xmlns:w14="http://schemas.microsoft.com/office/word/2010/wordml" xmlns:w15="http://schemas.microsoft.com/office/word/2012/wordml" xmlns:w16cei="http://schemas.microsoft.com/office/word/2026/wordml/cei" xmlns:w16cex="http://schemas.microsoft.com/office/word/2018/wordml/cex" xmlns:w16cid="http://schemas.microsoft.com/office/word/2016/wordml/cid" xmlns:w16="http://schemas.microsoft.com/office/word/2018/wordml" xmlns:w16sdtdh="http://schemas.microsoft.com/office/word/2020/wordml/sdtdatahash" xmlns:w16sdtfl="http://schemas.microsoft.com/office/word/2024/wordml/sdtformatlock" xmlns:w16se="http://schemas.microsoft.com/office/word/2015/wordml/symex" xmlns:w16du="http://schemas.microsoft.com/office/word/2023/wordml/word16du" xmlns:wne="http://schemas.microsoft.com/office/word/2006/wordml" mc:Ignorable="w14 w15 w16se w16cid w16 w16cex w16sdtdh w16sdtfl w16du wp14">
   <w16cid:commentId w16cid:paraId="6A349BC9" w16cid:durableId="5C7A62BB"/>
   <w16cid:commentId w16cid:paraId="0ED81B75" w16cid:durableId="28EADEDC"/>
   <w16cid:commentId w16cid:paraId="763FAF6B" w16cid:durableId="3201A5F4"/>
@@ -1021,11 +1164,14 @@
   <w16cid:commentId w16cid:paraId="4B8ADC60" w16cid:durableId="4C49AE1E"/>
   <w16cid:commentId w16cid:paraId="23BFEBAB" w16cid:durableId="366EC05D"/>
   <w16cid:commentId w16cid:paraId="7A5B5686" w16cid:durableId="22E3770A"/>
+  <w16cid:commentId w16cid:paraId="7A22DF8A" w16cid:durableId="62E2D218"/>
+  <w16cid:commentId w16cid:paraId="36AAE7A0" w16cid:durableId="4B332354"/>
+  <w16cid:commentId w16cid:paraId="1E52ED40" w16cid:durableId="6DCCDFDD"/>
 </w16cid:commentsIds>
 </file>
 
 <file path=word/numbering.xml><?xml version="1.0" encoding="utf-8"?>
-<w:numbering xmlns:wpc="http://schemas.microsoft.com/office/word/2010/wordprocessingCanvas" xmlns:cx="http://schemas.microsoft.com/office/drawing/2014/chartex" xmlns:cx1="http://schemas.microsoft.com/office/drawing/2015/9/8/chartex" xmlns:cx2="http://schemas.microsoft.com/office/drawing/2015/10/21/chartex" xmlns:cx3="http://schemas.microsoft.com/office/drawing/2016/5/9/chartex" xmlns:cx4="http://schemas.microsoft.com/office/drawing/2016/5/10/chartex" xmlns:cx5="http://schemas.microsoft.com/office/drawing/2016/5/11/chartex" xmlns:cx6="http://schemas.microsoft.com/office/drawing/2016/5/12/chartex" xmlns:cx7="http://schemas.microsoft.com/office/drawing/2016/5/13/chartex" xmlns:cx8="http://schemas.microsoft.com/office/drawing/2016/5/14/chartex" xmlns:mc="http://schemas.openxmlformats.org/markup-compatibility/2006" xmlns:aink="http://schemas.microsoft.com/office/drawing/2016/ink" xmlns:am3d="http://schemas.microsoft.com/office/drawing/2017/model3d" xmlns:o="urn:schemas-microsoft-com:office:office" xmlns:oel="http://schemas.microsoft.com/office/2019/extlst" xmlns:r="http://schemas.openxmlformats.org/officeDocument/2006/relationships" xmlns:m="http://schemas.openxmlformats.org/officeDocument/2006/math" xmlns:v="urn:schemas-microsoft-com:vml" xmlns:wp14="http://schemas.microsoft.com/office/word/2010/wordprocessingDrawing" xmlns:wp="http://schemas.openxmlformats.org/drawingml/2006/wordprocessingDrawing" xmlns:w10="urn:schemas-microsoft-com:office:word" xmlns:w="http://schemas.openxmlformats.org/wordprocessingml/2006/main" xmlns:w14="http://schemas.microsoft.com/office/word/2010/wordml" xmlns:w15="http://schemas.microsoft.com/office/word/2012/wordml" xmlns:w16cex="http://schemas.microsoft.com/office/word/2018/wordml/cex" xmlns:w16cid="http://schemas.microsoft.com/office/word/2016/wordml/cid" xmlns:w16="http://schemas.microsoft.com/office/word/2018/wordml" xmlns:w16du="http://schemas.microsoft.com/office/word/2023/wordml/word16du" xmlns:w16sdtdh="http://schemas.microsoft.com/office/word/2020/wordml/sdtdatahash" xmlns:w16sdtfl="http://schemas.microsoft.com/office/word/2024/wordml/sdtformatlock" xmlns:w16se="http://schemas.microsoft.com/office/word/2015/wordml/symex" xmlns:wpg="http://schemas.microsoft.com/office/word/2010/wordprocessingGroup" xmlns:wpi="http://schemas.microsoft.com/office/word/2010/wordprocessingInk" xmlns:wne="http://schemas.microsoft.com/office/word/2006/wordml" xmlns:wps="http://schemas.microsoft.com/office/word/2010/wordprocessingShape" mc:Ignorable="w14 w15 w16se w16cid w16 w16cex w16sdtdh w16sdtfl w16du wp14">
+<w:numbering xmlns:wpc="http://schemas.microsoft.com/office/word/2010/wordprocessingCanvas" xmlns:cx="http://schemas.microsoft.com/office/drawing/2014/chartex" xmlns:cx1="http://schemas.microsoft.com/office/drawing/2015/9/8/chartex" xmlns:cx2="http://schemas.microsoft.com/office/drawing/2015/10/21/chartex" xmlns:cx3="http://schemas.microsoft.com/office/drawing/2016/5/9/chartex" xmlns:cx4="http://schemas.microsoft.com/office/drawing/2016/5/10/chartex" xmlns:cx5="http://schemas.microsoft.com/office/drawing/2016/5/11/chartex" xmlns:cx6="http://schemas.microsoft.com/office/drawing/2016/5/12/chartex" xmlns:cx7="http://schemas.microsoft.com/office/drawing/2016/5/13/chartex" xmlns:cx8="http://schemas.microsoft.com/office/drawing/2016/5/14/chartex" xmlns:mc="http://schemas.openxmlformats.org/markup-compatibility/2006" xmlns:m="http://schemas.openxmlformats.org/officeDocument/2006/math" xmlns:aink="http://schemas.microsoft.com/office/drawing/2016/ink" xmlns:am3d="http://schemas.microsoft.com/office/drawing/2017/model3d" xmlns:oel="http://schemas.microsoft.com/office/2019/extlst" xmlns:r="http://schemas.openxmlformats.org/officeDocument/2006/relationships" xmlns:wp14="http://schemas.microsoft.com/office/word/2010/wordprocessingDrawing" xmlns:wp="http://schemas.openxmlformats.org/drawingml/2006/wordprocessingDrawing" xmlns:wpg="http://schemas.microsoft.com/office/word/2010/wordprocessingGroup" xmlns:wpi="http://schemas.microsoft.com/office/word/2010/wordprocessingInk" xmlns:wps="http://schemas.microsoft.com/office/word/2010/wordprocessingShape" xmlns:o="urn:schemas-microsoft-com:office:office" xmlns:v="urn:schemas-microsoft-com:vml" xmlns:w10="urn:schemas-microsoft-com:office:word" xmlns:w="http://schemas.openxmlformats.org/wordprocessingml/2006/main" xmlns:w14="http://schemas.microsoft.com/office/word/2010/wordml" xmlns:w15="http://schemas.microsoft.com/office/word/2012/wordml" xmlns:w16cei="http://schemas.microsoft.com/office/word/2026/wordml/cei" xmlns:w16cex="http://schemas.microsoft.com/office/word/2018/wordml/cex" xmlns:w16cid="http://schemas.microsoft.com/office/word/2016/wordml/cid" xmlns:w16="http://schemas.microsoft.com/office/word/2018/wordml" xmlns:w16sdtdh="http://schemas.microsoft.com/office/word/2020/wordml/sdtdatahash" xmlns:w16sdtfl="http://schemas.microsoft.com/office/word/2024/wordml/sdtformatlock" xmlns:w16se="http://schemas.microsoft.com/office/word/2015/wordml/symex" xmlns:w16du="http://schemas.microsoft.com/office/word/2023/wordml/word16du" xmlns:wne="http://schemas.microsoft.com/office/word/2006/wordml" mc:Ignorable="w14 w15 w16se w16cid w16 w16cex w16sdtdh w16sdtfl w16du wp14">
   <w:abstractNum w:abstractNumId="0" w15:restartNumberingAfterBreak="0">
     <w:nsid w:val="22D6192B"/>
     <w:multiLevelType w:val="hybridMultilevel"/>
@@ -1702,7 +1848,7 @@
   <w:abstractNum w:abstractNumId="5" w15:restartNumberingAfterBreak="0">
     <w:nsid w:val="79D76D5B"/>
     <w:multiLevelType w:val="hybridMultilevel"/>
-    <w:tmpl w:val="06763762"/>
+    <w:tmpl w:val="4F027A56"/>
     <w:lvl w:ilvl="0" w:tplc="04090001">
       <w:start w:val="1"/>
       <w:numFmt w:val="bullet"/>
@@ -1834,15 +1980,18 @@
 </file>
 
 <file path=word/people.xml><?xml version="1.0" encoding="utf-8"?>
-<w15:people xmlns:wpc="http://schemas.microsoft.com/office/word/2010/wordprocessingCanvas" xmlns:cx="http://schemas.microsoft.com/office/drawing/2014/chartex" xmlns:cx1="http://schemas.microsoft.com/office/drawing/2015/9/8/chartex" xmlns:cx2="http://schemas.microsoft.com/office/drawing/2015/10/21/chartex" xmlns:cx3="http://schemas.microsoft.com/office/drawing/2016/5/9/chartex" xmlns:cx4="http://schemas.microsoft.com/office/drawing/2016/5/10/chartex" xmlns:cx5="http://schemas.microsoft.com/office/drawing/2016/5/11/chartex" xmlns:cx6="http://schemas.microsoft.com/office/drawing/2016/5/12/chartex" xmlns:cx7="http://schemas.microsoft.com/office/drawing/2016/5/13/chartex" xmlns:cx8="http://schemas.microsoft.com/office/drawing/2016/5/14/chartex" xmlns:mc="http://schemas.openxmlformats.org/markup-compatibility/2006" xmlns:aink="http://schemas.microsoft.com/office/drawing/2016/ink" xmlns:am3d="http://schemas.microsoft.com/office/drawing/2017/model3d" xmlns:o="urn:schemas-microsoft-com:office:office" xmlns:oel="http://schemas.microsoft.com/office/2019/extlst" xmlns:r="http://schemas.openxmlformats.org/officeDocument/2006/relationships" xmlns:m="http://schemas.openxmlformats.org/officeDocument/2006/math" xmlns:v="urn:schemas-microsoft-com:vml" xmlns:wp14="http://schemas.microsoft.com/office/word/2010/wordprocessingDrawing" xmlns:wp="http://schemas.openxmlformats.org/drawingml/2006/wordprocessingDrawing" xmlns:w10="urn:schemas-microsoft-com:office:word" xmlns:w="http://schemas.openxmlformats.org/wordprocessingml/2006/main" xmlns:w14="http://schemas.microsoft.com/office/word/2010/wordml" xmlns:w15="http://schemas.microsoft.com/office/word/2012/wordml" xmlns:w16cex="http://schemas.microsoft.com/office/word/2018/wordml/cex" xmlns:w16cid="http://schemas.microsoft.com/office/word/2016/wordml/cid" xmlns:w16="http://schemas.microsoft.com/office/word/2018/wordml" xmlns:w16du="http://schemas.microsoft.com/office/word/2023/wordml/word16du" xmlns:w16sdtdh="http://schemas.microsoft.com/office/word/2020/wordml/sdtdatahash" xmlns:w16sdtfl="http://schemas.microsoft.com/office/word/2024/wordml/sdtformatlock" xmlns:w16se="http://schemas.microsoft.com/office/word/2015/wordml/symex" xmlns:wpg="http://schemas.microsoft.com/office/word/2010/wordprocessingGroup" xmlns:wpi="http://schemas.microsoft.com/office/word/2010/wordprocessingInk" xmlns:wne="http://schemas.microsoft.com/office/word/2006/wordml" xmlns:wps="http://schemas.microsoft.com/office/word/2010/wordprocessingShape" mc:Ignorable="w14 w15 w16se w16cid w16 w16cex w16sdtdh w16sdtfl w16du wp14">
+<w15:people xmlns:wpc="http://schemas.microsoft.com/office/word/2010/wordprocessingCanvas" xmlns:cx="http://schemas.microsoft.com/office/drawing/2014/chartex" xmlns:cx1="http://schemas.microsoft.com/office/drawing/2015/9/8/chartex" xmlns:cx2="http://schemas.microsoft.com/office/drawing/2015/10/21/chartex" xmlns:cx3="http://schemas.microsoft.com/office/drawing/2016/5/9/chartex" xmlns:cx4="http://schemas.microsoft.com/office/drawing/2016/5/10/chartex" xmlns:cx5="http://schemas.microsoft.com/office/drawing/2016/5/11/chartex" xmlns:cx6="http://schemas.microsoft.com/office/drawing/2016/5/12/chartex" xmlns:cx7="http://schemas.microsoft.com/office/drawing/2016/5/13/chartex" xmlns:cx8="http://schemas.microsoft.com/office/drawing/2016/5/14/chartex" xmlns:mc="http://schemas.openxmlformats.org/markup-compatibility/2006" xmlns:m="http://schemas.openxmlformats.org/officeDocument/2006/math" xmlns:aink="http://schemas.microsoft.com/office/drawing/2016/ink" xmlns:am3d="http://schemas.microsoft.com/office/drawing/2017/model3d" xmlns:oel="http://schemas.microsoft.com/office/2019/extlst" xmlns:r="http://schemas.openxmlformats.org/officeDocument/2006/relationships" xmlns:wp14="http://schemas.microsoft.com/office/word/2010/wordprocessingDrawing" xmlns:wp="http://schemas.openxmlformats.org/drawingml/2006/wordprocessingDrawing" xmlns:wpg="http://schemas.microsoft.com/office/word/2010/wordprocessingGroup" xmlns:wpi="http://schemas.microsoft.com/office/word/2010/wordprocessingInk" xmlns:wps="http://schemas.microsoft.com/office/word/2010/wordprocessingShape" xmlns:o="urn:schemas-microsoft-com:office:office" xmlns:v="urn:schemas-microsoft-com:vml" xmlns:w10="urn:schemas-microsoft-com:office:word" xmlns:w="http://schemas.openxmlformats.org/wordprocessingml/2006/main" xmlns:w14="http://schemas.microsoft.com/office/word/2010/wordml" xmlns:w15="http://schemas.microsoft.com/office/word/2012/wordml" xmlns:w16cei="http://schemas.microsoft.com/office/word/2026/wordml/cei" xmlns:w16cex="http://schemas.microsoft.com/office/word/2018/wordml/cex" xmlns:w16cid="http://schemas.microsoft.com/office/word/2016/wordml/cid" xmlns:w16="http://schemas.microsoft.com/office/word/2018/wordml" xmlns:w16sdtdh="http://schemas.microsoft.com/office/word/2020/wordml/sdtdatahash" xmlns:w16sdtfl="http://schemas.microsoft.com/office/word/2024/wordml/sdtformatlock" xmlns:w16se="http://schemas.microsoft.com/office/word/2015/wordml/symex" xmlns:w16du="http://schemas.microsoft.com/office/word/2023/wordml/word16du" xmlns:wne="http://schemas.microsoft.com/office/word/2006/wordml" mc:Ignorable="w14 w15 w16se w16cid w16 w16cex w16sdtdh w16sdtfl w16du wp14">
   <w15:person w15:author="Liam Degand">
     <w15:presenceInfo w15:providerId="AD" w15:userId="S::liamdegand@uvic.ca::1aacccb9-fb0e-4e4e-89df-6607ea601c1f"/>
+  </w15:person>
+  <w15:person w15:author="Sung-Yu Lin">
+    <w15:presenceInfo w15:providerId="AD" w15:userId="S::C0534903@camosun.ca::98435d22-9ec8-429a-87a8-f96a8bcfa554"/>
   </w15:person>
 </w15:people>
 </file>
 
 <file path=word/styles.xml><?xml version="1.0" encoding="utf-8"?>
-<w:styles xmlns:mc="http://schemas.openxmlformats.org/markup-compatibility/2006" xmlns:r="http://schemas.openxmlformats.org/officeDocument/2006/relationships" xmlns:w="http://schemas.openxmlformats.org/wordprocessingml/2006/main" xmlns:w14="http://schemas.microsoft.com/office/word/2010/wordml" xmlns:w15="http://schemas.microsoft.com/office/word/2012/wordml" xmlns:w16cex="http://schemas.microsoft.com/office/word/2018/wordml/cex" xmlns:w16cid="http://schemas.microsoft.com/office/word/2016/wordml/cid" xmlns:w16="http://schemas.microsoft.com/office/word/2018/wordml" xmlns:w16du="http://schemas.microsoft.com/office/word/2023/wordml/word16du" xmlns:w16sdtdh="http://schemas.microsoft.com/office/word/2020/wordml/sdtdatahash" xmlns:w16sdtfl="http://schemas.microsoft.com/office/word/2024/wordml/sdtformatlock" xmlns:w16se="http://schemas.microsoft.com/office/word/2015/wordml/symex" mc:Ignorable="w14 w15 w16se w16cid w16 w16cex w16sdtdh w16sdtfl w16du">
+<w:styles xmlns:mc="http://schemas.openxmlformats.org/markup-compatibility/2006" xmlns:r="http://schemas.openxmlformats.org/officeDocument/2006/relationships" xmlns:w="http://schemas.openxmlformats.org/wordprocessingml/2006/main" xmlns:w14="http://schemas.microsoft.com/office/word/2010/wordml" xmlns:w15="http://schemas.microsoft.com/office/word/2012/wordml" xmlns:w16cex="http://schemas.microsoft.com/office/word/2018/wordml/cex" xmlns:w16cid="http://schemas.microsoft.com/office/word/2016/wordml/cid" xmlns:w16="http://schemas.microsoft.com/office/word/2018/wordml" xmlns:w16sdtdh="http://schemas.microsoft.com/office/word/2020/wordml/sdtdatahash" xmlns:w16sdtfl="http://schemas.microsoft.com/office/word/2024/wordml/sdtformatlock" xmlns:w16se="http://schemas.microsoft.com/office/word/2015/wordml/symex" xmlns:w16du="http://schemas.microsoft.com/office/word/2023/wordml/word16du" mc:Ignorable="w14 w15 w16se w16cid w16 w16cex w16sdtdh w16sdtfl w16du">
   <w:docDefaults>
     <w:rPrDefault>
       <w:rPr>
@@ -2269,7 +2418,6 @@
     <w:next w:val="Normal"/>
     <w:link w:val="Heading2Char"/>
     <w:uiPriority w:val="9"/>
-    <w:semiHidden/>
     <w:unhideWhenUsed/>
     <w:qFormat/>
     <w:rsid w:val="00DF36DA"/>
@@ -2444,7 +2592,6 @@
   <w:style w:type="character" w:default="1" w:styleId="DefaultParagraphFont">
     <w:name w:val="Default Paragraph Font"/>
     <w:uiPriority w:val="1"/>
-    <w:semiHidden/>
     <w:unhideWhenUsed/>
   </w:style>
   <w:style w:type="table" w:default="1" w:styleId="TableNormal">
@@ -2486,7 +2633,6 @@
     <w:basedOn w:val="DefaultParagraphFont"/>
     <w:link w:val="Heading2"/>
     <w:uiPriority w:val="9"/>
-    <w:semiHidden/>
     <w:rsid w:val="00DF36DA"/>
     <w:rPr>
       <w:rFonts w:asciiTheme="majorHAnsi" w:eastAsiaTheme="majorEastAsia" w:hAnsiTheme="majorHAnsi" w:cstheme="majorBidi"/>

</xml_diff>

<commit_message>
Added completed meeting notes
</commit_message>
<xml_diff>
--- a/meetingNotes/12-08-2026.docx
+++ b/meetingNotes/12-08-2026.docx
@@ -1,6 +1,6 @@
 
 <file path=word/document.xml><?xml version="1.0" encoding="utf-8"?>
-<w:document xmlns:wpc="http://schemas.microsoft.com/office/word/2010/wordprocessingCanvas" xmlns:cx="http://schemas.microsoft.com/office/drawing/2014/chartex" xmlns:cx1="http://schemas.microsoft.com/office/drawing/2015/9/8/chartex" xmlns:cx2="http://schemas.microsoft.com/office/drawing/2015/10/21/chartex" xmlns:cx3="http://schemas.microsoft.com/office/drawing/2016/5/9/chartex" xmlns:cx4="http://schemas.microsoft.com/office/drawing/2016/5/10/chartex" xmlns:cx5="http://schemas.microsoft.com/office/drawing/2016/5/11/chartex" xmlns:cx6="http://schemas.microsoft.com/office/drawing/2016/5/12/chartex" xmlns:cx7="http://schemas.microsoft.com/office/drawing/2016/5/13/chartex" xmlns:cx8="http://schemas.microsoft.com/office/drawing/2016/5/14/chartex" xmlns:mc="http://schemas.openxmlformats.org/markup-compatibility/2006" xmlns:m="http://schemas.openxmlformats.org/officeDocument/2006/math" xmlns:aink="http://schemas.microsoft.com/office/drawing/2016/ink" xmlns:am3d="http://schemas.microsoft.com/office/drawing/2017/model3d" xmlns:oel="http://schemas.microsoft.com/office/2019/extlst" xmlns:r="http://schemas.openxmlformats.org/officeDocument/2006/relationships" xmlns:wp14="http://schemas.microsoft.com/office/word/2010/wordprocessingDrawing" xmlns:wp="http://schemas.openxmlformats.org/drawingml/2006/wordprocessingDrawing" xmlns:wpg="http://schemas.microsoft.com/office/word/2010/wordprocessingGroup" xmlns:wpi="http://schemas.microsoft.com/office/word/2010/wordprocessingInk" xmlns:wps="http://schemas.microsoft.com/office/word/2010/wordprocessingShape" xmlns:o="urn:schemas-microsoft-com:office:office" xmlns:v="urn:schemas-microsoft-com:vml" xmlns:w10="urn:schemas-microsoft-com:office:word" xmlns:w="http://schemas.openxmlformats.org/wordprocessingml/2006/main" xmlns:w14="http://schemas.microsoft.com/office/word/2010/wordml" xmlns:w15="http://schemas.microsoft.com/office/word/2012/wordml" xmlns:w16cei="http://schemas.microsoft.com/office/word/2026/wordml/cei" xmlns:w16cex="http://schemas.microsoft.com/office/word/2018/wordml/cex" xmlns:w16cid="http://schemas.microsoft.com/office/word/2016/wordml/cid" xmlns:w16="http://schemas.microsoft.com/office/word/2018/wordml" xmlns:w16sdtdh="http://schemas.microsoft.com/office/word/2020/wordml/sdtdatahash" xmlns:w16sdtfl="http://schemas.microsoft.com/office/word/2024/wordml/sdtformatlock" xmlns:w16se="http://schemas.microsoft.com/office/word/2015/wordml/symex" xmlns:w16du="http://schemas.microsoft.com/office/word/2023/wordml/word16du" xmlns:wne="http://schemas.microsoft.com/office/word/2006/wordml" mc:Ignorable="w14 w15 w16se w16cid w16 w16cex w16sdtdh w16sdtfl w16du wp14">
+<w:document xmlns:wpc="http://schemas.microsoft.com/office/word/2010/wordprocessingCanvas" xmlns:cx="http://schemas.microsoft.com/office/drawing/2014/chartex" xmlns:cx1="http://schemas.microsoft.com/office/drawing/2015/9/8/chartex" xmlns:cx2="http://schemas.microsoft.com/office/drawing/2015/10/21/chartex" xmlns:cx3="http://schemas.microsoft.com/office/drawing/2016/5/9/chartex" xmlns:cx4="http://schemas.microsoft.com/office/drawing/2016/5/10/chartex" xmlns:cx5="http://schemas.microsoft.com/office/drawing/2016/5/11/chartex" xmlns:cx6="http://schemas.microsoft.com/office/drawing/2016/5/12/chartex" xmlns:cx7="http://schemas.microsoft.com/office/drawing/2016/5/13/chartex" xmlns:cx8="http://schemas.microsoft.com/office/drawing/2016/5/14/chartex" xmlns:mc="http://schemas.openxmlformats.org/markup-compatibility/2006" xmlns:aink="http://schemas.microsoft.com/office/drawing/2016/ink" xmlns:am3d="http://schemas.microsoft.com/office/drawing/2017/model3d" xmlns:o="urn:schemas-microsoft-com:office:office" xmlns:oel="http://schemas.microsoft.com/office/2019/extlst" xmlns:r="http://schemas.openxmlformats.org/officeDocument/2006/relationships" xmlns:m="http://schemas.openxmlformats.org/officeDocument/2006/math" xmlns:v="urn:schemas-microsoft-com:vml" xmlns:wp14="http://schemas.microsoft.com/office/word/2010/wordprocessingDrawing" xmlns:wp="http://schemas.openxmlformats.org/drawingml/2006/wordprocessingDrawing" xmlns:w10="urn:schemas-microsoft-com:office:word" xmlns:w="http://schemas.openxmlformats.org/wordprocessingml/2006/main" xmlns:w14="http://schemas.microsoft.com/office/word/2010/wordml" xmlns:w15="http://schemas.microsoft.com/office/word/2012/wordml" xmlns:w16cex="http://schemas.microsoft.com/office/word/2018/wordml/cex" xmlns:w16cid="http://schemas.microsoft.com/office/word/2016/wordml/cid" xmlns:w16="http://schemas.microsoft.com/office/word/2018/wordml" xmlns:w16du="http://schemas.microsoft.com/office/word/2023/wordml/word16du" xmlns:w16sdtdh="http://schemas.microsoft.com/office/word/2020/wordml/sdtdatahash" xmlns:w16sdtfl="http://schemas.microsoft.com/office/word/2024/wordml/sdtformatlock" xmlns:w16se="http://schemas.microsoft.com/office/word/2015/wordml/symex" xmlns:wpg="http://schemas.microsoft.com/office/word/2010/wordprocessingGroup" xmlns:wpi="http://schemas.microsoft.com/office/word/2010/wordprocessingInk" xmlns:wne="http://schemas.microsoft.com/office/word/2006/wordml" xmlns:wps="http://schemas.microsoft.com/office/word/2010/wordprocessingShape" mc:Ignorable="w14 w15 w16se w16cid w16 w16cex w16sdtdh w16sdtfl w16du wp14">
   <w:body>
     <w:p>
       <w:pPr>
@@ -152,15 +152,29 @@
         <w:pStyle w:val="ListParagraph"/>
         <w:numPr>
           <w:ilvl w:val="0"/>
+          <w:numId w:val="6"/>
+        </w:numPr>
+      </w:pPr>
+      <w:r>
+        <w:t xml:space="preserve">Start Researching: </w:t>
+      </w:r>
+      <w:r>
+        <w:t>Extending ROS 2 UAV simulators (PX4 + Gazebo/Ignition) with attack injection and full telemetry logging</w:t>
+      </w:r>
+      <w:r>
+        <w:t xml:space="preserve">. Goal is to create a dataset of known vulnerabilities and a tool (simulation) to explore them with. </w:t>
+      </w:r>
+    </w:p>
+    <w:p>
+      <w:pPr>
+        <w:pStyle w:val="ListParagraph"/>
+        <w:numPr>
+          <w:ilvl w:val="0"/>
           <w:numId w:val="2"/>
         </w:numPr>
-        <w:rPr>
-          <w:sz w:val="28"/>
-          <w:szCs w:val="28"/>
-        </w:rPr>
-      </w:pPr>
-      <w:r>
-        <w:t>hjb</w:t>
+      </w:pPr>
+      <w:r>
+        <w:t>Start with deep research on the topic!!!!!!!</w:t>
       </w:r>
     </w:p>
     <w:p>
@@ -194,6 +208,15 @@
       <w:r>
         <w:t>Recent Activity (July 2026)</w:t>
       </w:r>
+      <w:r>
+        <w:t xml:space="preserve"> </w:t>
+      </w:r>
+      <w:r>
+        <w:rPr>
+          <w:highlight w:val="yellow"/>
+        </w:rPr>
+        <w:t>Literature review, and researched new topics</w:t>
+      </w:r>
     </w:p>
     <w:p>
       <w:pPr>
@@ -232,6 +255,15 @@
       <w:r>
         <w:t>Mid-Period Work (June-July 2026)</w:t>
       </w:r>
+      <w:r>
+        <w:t xml:space="preserve"> </w:t>
+      </w:r>
+      <w:r>
+        <w:rPr>
+          <w:highlight w:val="yellow"/>
+        </w:rPr>
+        <w:t>Refactored experiment repo, added new experiment plan with a more rigorous methodology, added updated ROS2 images with gazebo compatibility to docker</w:t>
+      </w:r>
     </w:p>
     <w:p>
       <w:pPr>
@@ -263,6 +295,7 @@
         </w:numPr>
       </w:pPr>
       <w:r>
+        <w:lastRenderedPageBreak/>
         <w:t>June 8: Updated three ROS2 images to be Gazebo compatible; merged changes from main branch</w:t>
       </w:r>
     </w:p>
@@ -285,13 +318,24 @@
         </w:numPr>
       </w:pPr>
       <w:r>
-        <w:lastRenderedPageBreak/>
         <w:t>June 1: Added outline for a meeting</w:t>
       </w:r>
     </w:p>
     <w:p>
       <w:r>
         <w:t>Earlier Work (May 2026)</w:t>
+      </w:r>
+      <w:r>
+        <w:t xml:space="preserve"> </w:t>
+      </w:r>
+      <w:r>
+        <w:rPr>
+          <w:highlight w:val="yellow"/>
+        </w:rPr>
+        <w:t>Cyclone DDS experiments, Rough draft for paper, and confirm experiment not valid.</w:t>
+      </w:r>
+      <w:r>
+        <w:t xml:space="preserve"> </w:t>
       </w:r>
     </w:p>
     <w:p>
@@ -367,16 +411,49 @@
     </w:p>
     <w:p>
       <w:r>
-        <w:t>GAP suppression is named in the standard. The OMG DDS-Security specification's RTPS-message-protection threat analysis (§7.5.3.1, p. 61) states verbatim that "a Gap RTPS Submessage instructs a DataReader that a range of sequence numbers is no longer relevant. If an attacker can modify or forge a Gap message from a DataWriter, it can trick the DataReader into ignoring the data that the DataWriter is sending" [1]. That is precisely the GAP mechanism. The same section motivates encryption/signing exactly because plain RTPS is unauthenticated, and §7.3.3 documents the "squatter attack," where a participant announces itself under another participant's GUID [1].</w:t>
-      </w:r>
-    </w:p>
-    <w:p>
-      <w:r>
-        <w:t>Sequence-number and heartbeat suppression are published DoS results. eProsima Fast-DDS issue #3931 documents the identical persistence property we claim in §5.2: a spoofed heartbeat with an inflated sequence number (GUID/IP/port forged) advances the reader's state so all real samples are treated as "already received," blacking out the writer until it catches up [2].</w:t>
-      </w:r>
-    </w:p>
-    <w:p>
-      <w:r>
+        <w:t xml:space="preserve">GAP suppression is named in the standard. The </w:t>
+      </w:r>
+      <w:r>
+        <w:rPr>
+          <w:highlight w:val="yellow"/>
+        </w:rPr>
+        <w:t>OMG DDS-Security specification's RTPS-message-protection threat analysis (§7.5.3.1, p. 61)</w:t>
+      </w:r>
+      <w:r>
+        <w:t xml:space="preserve"> states verbatim that "a Gap RTPS Submessage instructs a DataReader that a range of sequence numbers is no longer relevant. If an attacker can modify or forge a Gap message from a DataWriter, it can trick the DataReader into ignoring the data that the DataWriter is sending" [1]. </w:t>
+      </w:r>
+      <w:r>
+        <w:rPr>
+          <w:highlight w:val="yellow"/>
+        </w:rPr>
+        <w:t>That is precisely the GAP mechanism.</w:t>
+      </w:r>
+      <w:r>
+        <w:t xml:space="preserve"> The same section motivates encryption/signing exactly because plain RTPS is unauthenticated, and </w:t>
+      </w:r>
+      <w:r>
+        <w:rPr>
+          <w:highlight w:val="yellow"/>
+        </w:rPr>
+        <w:t>§7.3.3 documents the "squatter attack," where a participant announces itself under another participant's GUID [1].</w:t>
+      </w:r>
+    </w:p>
+    <w:p>
+      <w:r>
+        <w:rPr>
+          <w:highlight w:val="yellow"/>
+        </w:rPr>
+        <w:t>Sequence-number and heartbeat suppression are published DoS results</w:t>
+      </w:r>
+      <w:r>
+        <w:t>. eProsima Fast-DDS issue #3931 documents the identical persistence property we claim in §5.2: a spoofed heartbeat with an inflated sequence number (GUID/IP/port forged) advances the reader's state so all real samples are treated as "already received," blacking out the writer until it catches up [2].</w:t>
+      </w:r>
+    </w:p>
+    <w:p>
+      <w:r>
+        <w:rPr>
+          <w:highlight w:val="yellow"/>
+        </w:rPr>
         <w:t>GUID spoofing over plaintext RTPS is a CVE. CVE-2023-50257 (GHSA-v5r6-8mvh-cp98) exploits unencrypted RTPS GUIDs to forge submessages and force subscriber disconnection without authentication [3].</w:t>
       </w:r>
     </w:p>
@@ -385,7 +462,6 @@
     <w:p/>
     <w:p>
       <w:r>
-        <w:lastRenderedPageBreak/>
         <w:t>References</w:t>
       </w:r>
     </w:p>
@@ -421,7 +497,19 @@
           <w:rPr>
             <w:rStyle w:val="Hyperlink"/>
           </w:rPr>
-          <w:t>eProsima/Fast-DDS#3931</w:t>
+          <w:t>eProsima/Fast-DDS#</w:t>
+        </w:r>
+        <w:r>
+          <w:rPr>
+            <w:rStyle w:val="Hyperlink"/>
+          </w:rPr>
+          <w:t>3</w:t>
+        </w:r>
+        <w:r>
+          <w:rPr>
+            <w:rStyle w:val="Hyperlink"/>
+          </w:rPr>
+          <w:t>931</w:t>
         </w:r>
       </w:hyperlink>
     </w:p>
@@ -434,7 +522,19 @@
           <w:rPr>
             <w:rStyle w:val="Hyperlink"/>
           </w:rPr>
-          <w:t>https://github.com/eProsima/Fast-DDS/security/advisories/GHSA-v5r6-8mvh-cp98</w:t>
+          <w:t>https://github.com/eProsima/Fast</w:t>
+        </w:r>
+        <w:r>
+          <w:rPr>
+            <w:rStyle w:val="Hyperlink"/>
+          </w:rPr>
+          <w:t>-</w:t>
+        </w:r>
+        <w:r>
+          <w:rPr>
+            <w:rStyle w:val="Hyperlink"/>
+          </w:rPr>
+          <w:t>DDS/security/advisories/GHSA-v5r6-8mvh-cp98</w:t>
         </w:r>
       </w:hyperlink>
     </w:p>
@@ -594,6 +694,7 @@
       </w:pPr>
       <w:commentRangeStart w:id="7"/>
       <w:commentRangeStart w:id="8"/>
+      <w:commentRangeStart w:id="9"/>
       <w:r>
         <w:t>Extending ROS 2 UAV simulators (PX4 + Gazebo/Ignition) with attack injection and full telemetry logging</w:t>
       </w:r>
@@ -627,15 +728,24 @@
         </w:rPr>
         <w:commentReference w:id="8"/>
       </w:r>
+      <w:commentRangeEnd w:id="9"/>
+      <w:r>
+        <w:rPr>
+          <w:rStyle w:val="CommentReference"/>
+          <w:sz w:val="24"/>
+          <w:szCs w:val="24"/>
+        </w:rPr>
+        <w:commentReference w:id="9"/>
+      </w:r>
     </w:p>
     <w:bookmarkEnd w:id="6"/>
     <w:p>
       <w:r>
         <w:t>Metadata in SROS</w:t>
       </w:r>
-      <w:bookmarkStart w:id="9" w:name="_Hlk237370109"/>
-    </w:p>
-    <w:bookmarkEnd w:id="9"/>
+      <w:bookmarkStart w:id="10" w:name="_Hlk237370109"/>
+    </w:p>
+    <w:bookmarkEnd w:id="10"/>
     <w:p>
       <w:pPr>
         <w:pStyle w:val="ListParagraph"/>
@@ -644,28 +754,28 @@
           <w:numId w:val="6"/>
         </w:numPr>
       </w:pPr>
-      <w:commentRangeStart w:id="10"/>
       <w:commentRangeStart w:id="11"/>
+      <w:commentRangeStart w:id="12"/>
       <w:r>
         <w:t>Behavioral leakage in correctly-configured SROS2</w:t>
       </w:r>
-      <w:commentRangeEnd w:id="10"/>
+      <w:commentRangeEnd w:id="11"/>
       <w:r>
         <w:rPr>
           <w:rStyle w:val="CommentReference"/>
           <w:sz w:val="24"/>
           <w:szCs w:val="24"/>
         </w:rPr>
-        <w:commentReference w:id="10"/>
-      </w:r>
-      <w:commentRangeEnd w:id="11"/>
+        <w:commentReference w:id="11"/>
+      </w:r>
+      <w:commentRangeEnd w:id="12"/>
       <w:r>
         <w:rPr>
           <w:rStyle w:val="CommentReference"/>
           <w:sz w:val="24"/>
           <w:szCs w:val="24"/>
         </w:rPr>
-        <w:commentReference w:id="11"/>
+        <w:commentReference w:id="12"/>
       </w:r>
     </w:p>
     <w:p>
@@ -681,18 +791,18 @@
           <w:numId w:val="6"/>
         </w:numPr>
       </w:pPr>
-      <w:commentRangeStart w:id="12"/>
+      <w:commentRangeStart w:id="13"/>
       <w:r>
         <w:t>Safety-invariant violation on manipulators via world-model poisoning</w:t>
       </w:r>
-      <w:commentRangeEnd w:id="12"/>
+      <w:commentRangeEnd w:id="13"/>
       <w:r>
         <w:rPr>
           <w:rStyle w:val="CommentReference"/>
           <w:sz w:val="24"/>
           <w:szCs w:val="24"/>
         </w:rPr>
-        <w:commentReference w:id="12"/>
+        <w:commentReference w:id="13"/>
       </w:r>
     </w:p>
     <w:sectPr>
@@ -706,7 +816,7 @@
 </file>
 
 <file path=word/comments.xml><?xml version="1.0" encoding="utf-8"?>
-<w:comments xmlns:wpc="http://schemas.microsoft.com/office/word/2010/wordprocessingCanvas" xmlns:cx="http://schemas.microsoft.com/office/drawing/2014/chartex" xmlns:cx1="http://schemas.microsoft.com/office/drawing/2015/9/8/chartex" xmlns:cx2="http://schemas.microsoft.com/office/drawing/2015/10/21/chartex" xmlns:cx3="http://schemas.microsoft.com/office/drawing/2016/5/9/chartex" xmlns:cx4="http://schemas.microsoft.com/office/drawing/2016/5/10/chartex" xmlns:cx5="http://schemas.microsoft.com/office/drawing/2016/5/11/chartex" xmlns:cx6="http://schemas.microsoft.com/office/drawing/2016/5/12/chartex" xmlns:cx7="http://schemas.microsoft.com/office/drawing/2016/5/13/chartex" xmlns:cx8="http://schemas.microsoft.com/office/drawing/2016/5/14/chartex" xmlns:mc="http://schemas.openxmlformats.org/markup-compatibility/2006" xmlns:m="http://schemas.openxmlformats.org/officeDocument/2006/math" xmlns:aink="http://schemas.microsoft.com/office/drawing/2016/ink" xmlns:am3d="http://schemas.microsoft.com/office/drawing/2017/model3d" xmlns:oel="http://schemas.microsoft.com/office/2019/extlst" xmlns:r="http://schemas.openxmlformats.org/officeDocument/2006/relationships" xmlns:wp14="http://schemas.microsoft.com/office/word/2010/wordprocessingDrawing" xmlns:wp="http://schemas.openxmlformats.org/drawingml/2006/wordprocessingDrawing" xmlns:wpg="http://schemas.microsoft.com/office/word/2010/wordprocessingGroup" xmlns:wpi="http://schemas.microsoft.com/office/word/2010/wordprocessingInk" xmlns:wps="http://schemas.microsoft.com/office/word/2010/wordprocessingShape" xmlns:o="urn:schemas-microsoft-com:office:office" xmlns:v="urn:schemas-microsoft-com:vml" xmlns:w10="urn:schemas-microsoft-com:office:word" xmlns:w="http://schemas.openxmlformats.org/wordprocessingml/2006/main" xmlns:w14="http://schemas.microsoft.com/office/word/2010/wordml" xmlns:w15="http://schemas.microsoft.com/office/word/2012/wordml" xmlns:w16cei="http://schemas.microsoft.com/office/word/2026/wordml/cei" xmlns:w16cex="http://schemas.microsoft.com/office/word/2018/wordml/cex" xmlns:w16cid="http://schemas.microsoft.com/office/word/2016/wordml/cid" xmlns:w16="http://schemas.microsoft.com/office/word/2018/wordml" xmlns:w16sdtdh="http://schemas.microsoft.com/office/word/2020/wordml/sdtdatahash" xmlns:w16sdtfl="http://schemas.microsoft.com/office/word/2024/wordml/sdtformatlock" xmlns:w16se="http://schemas.microsoft.com/office/word/2015/wordml/symex" xmlns:w16du="http://schemas.microsoft.com/office/word/2023/wordml/word16du" xmlns:wne="http://schemas.microsoft.com/office/word/2006/wordml" mc:Ignorable="w14 w15 w16se w16cid w16 w16cex w16sdtdh w16sdtfl w16du wp14">
+<w:comments xmlns:wpc="http://schemas.microsoft.com/office/word/2010/wordprocessingCanvas" xmlns:cx="http://schemas.microsoft.com/office/drawing/2014/chartex" xmlns:cx1="http://schemas.microsoft.com/office/drawing/2015/9/8/chartex" xmlns:cx2="http://schemas.microsoft.com/office/drawing/2015/10/21/chartex" xmlns:cx3="http://schemas.microsoft.com/office/drawing/2016/5/9/chartex" xmlns:cx4="http://schemas.microsoft.com/office/drawing/2016/5/10/chartex" xmlns:cx5="http://schemas.microsoft.com/office/drawing/2016/5/11/chartex" xmlns:cx6="http://schemas.microsoft.com/office/drawing/2016/5/12/chartex" xmlns:cx7="http://schemas.microsoft.com/office/drawing/2016/5/13/chartex" xmlns:cx8="http://schemas.microsoft.com/office/drawing/2016/5/14/chartex" xmlns:mc="http://schemas.openxmlformats.org/markup-compatibility/2006" xmlns:aink="http://schemas.microsoft.com/office/drawing/2016/ink" xmlns:am3d="http://schemas.microsoft.com/office/drawing/2017/model3d" xmlns:o="urn:schemas-microsoft-com:office:office" xmlns:oel="http://schemas.microsoft.com/office/2019/extlst" xmlns:r="http://schemas.openxmlformats.org/officeDocument/2006/relationships" xmlns:m="http://schemas.openxmlformats.org/officeDocument/2006/math" xmlns:v="urn:schemas-microsoft-com:vml" xmlns:wp14="http://schemas.microsoft.com/office/word/2010/wordprocessingDrawing" xmlns:wp="http://schemas.openxmlformats.org/drawingml/2006/wordprocessingDrawing" xmlns:w10="urn:schemas-microsoft-com:office:word" xmlns:w="http://schemas.openxmlformats.org/wordprocessingml/2006/main" xmlns:w14="http://schemas.microsoft.com/office/word/2010/wordml" xmlns:w15="http://schemas.microsoft.com/office/word/2012/wordml" xmlns:w16cex="http://schemas.microsoft.com/office/word/2018/wordml/cex" xmlns:w16cid="http://schemas.microsoft.com/office/word/2016/wordml/cid" xmlns:w16="http://schemas.microsoft.com/office/word/2018/wordml" xmlns:w16du="http://schemas.microsoft.com/office/word/2023/wordml/word16du" xmlns:w16sdtdh="http://schemas.microsoft.com/office/word/2020/wordml/sdtdatahash" xmlns:w16sdtfl="http://schemas.microsoft.com/office/word/2024/wordml/sdtformatlock" xmlns:w16se="http://schemas.microsoft.com/office/word/2015/wordml/symex" xmlns:wpg="http://schemas.microsoft.com/office/word/2010/wordprocessingGroup" xmlns:wpi="http://schemas.microsoft.com/office/word/2010/wordprocessingInk" xmlns:wne="http://schemas.microsoft.com/office/word/2006/wordml" xmlns:wps="http://schemas.microsoft.com/office/word/2010/wordprocessingShape" mc:Ignorable="w14 w15 w16se w16cid w16 w16cex w16sdtdh w16sdtfl w16du wp14">
   <w:comment w:id="0" w:author="Liam Degand" w:date="2026-08-12T10:51:00Z" w:initials="LD">
     <w:p>
       <w:pPr>
@@ -1040,7 +1150,23 @@
       </w:r>
     </w:p>
   </w:comment>
-  <w:comment w:id="10" w:author="Sung-Yu Lin" w:date="2026-08-11T19:51:00Z" w:initials="SYL">
+  <w:comment w:id="9" w:author="Liam Degand" w:date="2026-08-13T07:34:00Z" w:initials="LD">
+    <w:p>
+      <w:pPr>
+        <w:pStyle w:val="CommentText"/>
+      </w:pPr>
+      <w:r>
+        <w:rPr>
+          <w:rStyle w:val="CommentReference"/>
+        </w:rPr>
+        <w:annotationRef/>
+      </w:r>
+      <w:r>
+        <w:t xml:space="preserve">Ardeshir liked this idea. </w:t>
+      </w:r>
+    </w:p>
+  </w:comment>
+  <w:comment w:id="11" w:author="Sung-Yu Lin" w:date="2026-08-11T19:51:00Z" w:initials="SYL">
     <w:p>
       <w:r>
         <w:rPr>
@@ -1085,7 +1211,7 @@
       </w:r>
     </w:p>
   </w:comment>
-  <w:comment w:id="11" w:author="Sung-Yu Lin" w:date="2026-08-11T20:09:00Z" w:initials="SYL">
+  <w:comment w:id="12" w:author="Sung-Yu Lin" w:date="2026-08-11T20:09:00Z" w:initials="SYL">
     <w:p>
       <w:r>
         <w:rPr>
@@ -1102,7 +1228,7 @@
       </w:r>
     </w:p>
   </w:comment>
-  <w:comment w:id="12" w:author="Sung-Yu Lin" w:date="2026-08-11T20:36:00Z" w:initials="SYL">
+  <w:comment w:id="13" w:author="Sung-Yu Lin" w:date="2026-08-11T20:36:00Z" w:initials="SYL">
     <w:p>
       <w:r>
         <w:rPr>
@@ -1123,7 +1249,7 @@
 </file>
 
 <file path=word/commentsExtended.xml><?xml version="1.0" encoding="utf-8"?>
-<w15:commentsEx xmlns:wpc="http://schemas.microsoft.com/office/word/2010/wordprocessingCanvas" xmlns:cx="http://schemas.microsoft.com/office/drawing/2014/chartex" xmlns:cx1="http://schemas.microsoft.com/office/drawing/2015/9/8/chartex" xmlns:cx2="http://schemas.microsoft.com/office/drawing/2015/10/21/chartex" xmlns:cx3="http://schemas.microsoft.com/office/drawing/2016/5/9/chartex" xmlns:cx4="http://schemas.microsoft.com/office/drawing/2016/5/10/chartex" xmlns:cx5="http://schemas.microsoft.com/office/drawing/2016/5/11/chartex" xmlns:cx6="http://schemas.microsoft.com/office/drawing/2016/5/12/chartex" xmlns:cx7="http://schemas.microsoft.com/office/drawing/2016/5/13/chartex" xmlns:cx8="http://schemas.microsoft.com/office/drawing/2016/5/14/chartex" xmlns:mc="http://schemas.openxmlformats.org/markup-compatibility/2006" xmlns:m="http://schemas.openxmlformats.org/officeDocument/2006/math" xmlns:aink="http://schemas.microsoft.com/office/drawing/2016/ink" xmlns:am3d="http://schemas.microsoft.com/office/drawing/2017/model3d" xmlns:oel="http://schemas.microsoft.com/office/2019/extlst" xmlns:r="http://schemas.openxmlformats.org/officeDocument/2006/relationships" xmlns:wp14="http://schemas.microsoft.com/office/word/2010/wordprocessingDrawing" xmlns:wp="http://schemas.openxmlformats.org/drawingml/2006/wordprocessingDrawing" xmlns:wpg="http://schemas.microsoft.com/office/word/2010/wordprocessingGroup" xmlns:wpi="http://schemas.microsoft.com/office/word/2010/wordprocessingInk" xmlns:wps="http://schemas.microsoft.com/office/word/2010/wordprocessingShape" xmlns:o="urn:schemas-microsoft-com:office:office" xmlns:v="urn:schemas-microsoft-com:vml" xmlns:w10="urn:schemas-microsoft-com:office:word" xmlns:w="http://schemas.openxmlformats.org/wordprocessingml/2006/main" xmlns:w14="http://schemas.microsoft.com/office/word/2010/wordml" xmlns:w15="http://schemas.microsoft.com/office/word/2012/wordml" xmlns:w16cei="http://schemas.microsoft.com/office/word/2026/wordml/cei" xmlns:w16cex="http://schemas.microsoft.com/office/word/2018/wordml/cex" xmlns:w16cid="http://schemas.microsoft.com/office/word/2016/wordml/cid" xmlns:w16="http://schemas.microsoft.com/office/word/2018/wordml" xmlns:w16sdtdh="http://schemas.microsoft.com/office/word/2020/wordml/sdtdatahash" xmlns:w16sdtfl="http://schemas.microsoft.com/office/word/2024/wordml/sdtformatlock" xmlns:w16se="http://schemas.microsoft.com/office/word/2015/wordml/symex" xmlns:w16du="http://schemas.microsoft.com/office/word/2023/wordml/word16du" xmlns:wne="http://schemas.microsoft.com/office/word/2006/wordml" mc:Ignorable="w14 w15 w16se w16cid w16 w16cex w16sdtdh w16sdtfl w16du wp14">
+<w15:commentsEx xmlns:wpc="http://schemas.microsoft.com/office/word/2010/wordprocessingCanvas" xmlns:cx="http://schemas.microsoft.com/office/drawing/2014/chartex" xmlns:cx1="http://schemas.microsoft.com/office/drawing/2015/9/8/chartex" xmlns:cx2="http://schemas.microsoft.com/office/drawing/2015/10/21/chartex" xmlns:cx3="http://schemas.microsoft.com/office/drawing/2016/5/9/chartex" xmlns:cx4="http://schemas.microsoft.com/office/drawing/2016/5/10/chartex" xmlns:cx5="http://schemas.microsoft.com/office/drawing/2016/5/11/chartex" xmlns:cx6="http://schemas.microsoft.com/office/drawing/2016/5/12/chartex" xmlns:cx7="http://schemas.microsoft.com/office/drawing/2016/5/13/chartex" xmlns:cx8="http://schemas.microsoft.com/office/drawing/2016/5/14/chartex" xmlns:mc="http://schemas.openxmlformats.org/markup-compatibility/2006" xmlns:aink="http://schemas.microsoft.com/office/drawing/2016/ink" xmlns:am3d="http://schemas.microsoft.com/office/drawing/2017/model3d" xmlns:o="urn:schemas-microsoft-com:office:office" xmlns:oel="http://schemas.microsoft.com/office/2019/extlst" xmlns:r="http://schemas.openxmlformats.org/officeDocument/2006/relationships" xmlns:m="http://schemas.openxmlformats.org/officeDocument/2006/math" xmlns:v="urn:schemas-microsoft-com:vml" xmlns:wp14="http://schemas.microsoft.com/office/word/2010/wordprocessingDrawing" xmlns:wp="http://schemas.openxmlformats.org/drawingml/2006/wordprocessingDrawing" xmlns:w10="urn:schemas-microsoft-com:office:word" xmlns:w="http://schemas.openxmlformats.org/wordprocessingml/2006/main" xmlns:w14="http://schemas.microsoft.com/office/word/2010/wordml" xmlns:w15="http://schemas.microsoft.com/office/word/2012/wordml" xmlns:w16cex="http://schemas.microsoft.com/office/word/2018/wordml/cex" xmlns:w16cid="http://schemas.microsoft.com/office/word/2016/wordml/cid" xmlns:w16="http://schemas.microsoft.com/office/word/2018/wordml" xmlns:w16du="http://schemas.microsoft.com/office/word/2023/wordml/word16du" xmlns:w16sdtdh="http://schemas.microsoft.com/office/word/2020/wordml/sdtdatahash" xmlns:w16sdtfl="http://schemas.microsoft.com/office/word/2024/wordml/sdtformatlock" xmlns:w16se="http://schemas.microsoft.com/office/word/2015/wordml/symex" xmlns:wpg="http://schemas.microsoft.com/office/word/2010/wordprocessingGroup" xmlns:wpi="http://schemas.microsoft.com/office/word/2010/wordprocessingInk" xmlns:wne="http://schemas.microsoft.com/office/word/2006/wordml" xmlns:wps="http://schemas.microsoft.com/office/word/2010/wordprocessingShape" mc:Ignorable="w14 w15 w16se w16cid w16 w16cex w16sdtdh w16sdtfl w16du wp14">
   <w15:commentEx w15:paraId="6A349BC9" w15:done="0"/>
   <w15:commentEx w15:paraId="0ED81B75" w15:paraIdParent="6A349BC9" w15:done="0"/>
   <w15:commentEx w15:paraId="763FAF6B" w15:paraIdParent="6A349BC9" w15:done="0"/>
@@ -1132,6 +1258,7 @@
   <w15:commentEx w15:paraId="4B8ADC60" w15:paraIdParent="6A349BC9" w15:done="0"/>
   <w15:commentEx w15:paraId="23BFEBAB" w15:done="0"/>
   <w15:commentEx w15:paraId="7A5B5686" w15:paraIdParent="23BFEBAB" w15:done="0"/>
+  <w15:commentEx w15:paraId="320DC1CD" w15:paraIdParent="23BFEBAB" w15:done="0"/>
   <w15:commentEx w15:paraId="7A22DF8A" w15:done="0"/>
   <w15:commentEx w15:paraId="36AAE7A0" w15:paraIdParent="7A22DF8A" w15:done="0"/>
   <w15:commentEx w15:paraId="1E52ED40" w15:done="0"/>
@@ -1139,7 +1266,7 @@
 </file>
 
 <file path=word/commentsExtensible.xml><?xml version="1.0" encoding="utf-8"?>
-<w16cex:commentsExtensible xmlns:wpc="http://schemas.microsoft.com/office/word/2010/wordprocessingCanvas" xmlns:cx="http://schemas.microsoft.com/office/drawing/2014/chartex" xmlns:cx1="http://schemas.microsoft.com/office/drawing/2015/9/8/chartex" xmlns:cx2="http://schemas.microsoft.com/office/drawing/2015/10/21/chartex" xmlns:cx3="http://schemas.microsoft.com/office/drawing/2016/5/9/chartex" xmlns:cx4="http://schemas.microsoft.com/office/drawing/2016/5/10/chartex" xmlns:cx5="http://schemas.microsoft.com/office/drawing/2016/5/11/chartex" xmlns:cx6="http://schemas.microsoft.com/office/drawing/2016/5/12/chartex" xmlns:cx7="http://schemas.microsoft.com/office/drawing/2016/5/13/chartex" xmlns:cx8="http://schemas.microsoft.com/office/drawing/2016/5/14/chartex" xmlns:cr="http://schemas.microsoft.com/office/comments/2020/reactions" xmlns:mc="http://schemas.openxmlformats.org/markup-compatibility/2006" xmlns:m="http://schemas.openxmlformats.org/officeDocument/2006/math" xmlns:aink="http://schemas.microsoft.com/office/drawing/2016/ink" xmlns:am3d="http://schemas.microsoft.com/office/drawing/2017/model3d" xmlns:oel="http://schemas.microsoft.com/office/2019/extlst" xmlns:r="http://schemas.openxmlformats.org/officeDocument/2006/relationships" xmlns:wp14="http://schemas.microsoft.com/office/word/2010/wordprocessingDrawing" xmlns:wp="http://schemas.openxmlformats.org/drawingml/2006/wordprocessingDrawing" xmlns:wpg="http://schemas.microsoft.com/office/word/2010/wordprocessingGroup" xmlns:wpi="http://schemas.microsoft.com/office/word/2010/wordprocessingInk" xmlns:wps="http://schemas.microsoft.com/office/word/2010/wordprocessingShape" xmlns:o="urn:schemas-microsoft-com:office:office" xmlns:v="urn:schemas-microsoft-com:vml" xmlns:w10="urn:schemas-microsoft-com:office:word" xmlns:w="http://schemas.openxmlformats.org/wordprocessingml/2006/main" xmlns:w14="http://schemas.microsoft.com/office/word/2010/wordml" xmlns:w15="http://schemas.microsoft.com/office/word/2012/wordml" xmlns:w16cei="http://schemas.microsoft.com/office/word/2026/wordml/cei" xmlns:w16cex="http://schemas.microsoft.com/office/word/2018/wordml/cex" xmlns:w16cid="http://schemas.microsoft.com/office/word/2016/wordml/cid" xmlns:w16="http://schemas.microsoft.com/office/word/2018/wordml" xmlns:w16sdtdh="http://schemas.microsoft.com/office/word/2020/wordml/sdtdatahash" xmlns:w16sdtfl="http://schemas.microsoft.com/office/word/2024/wordml/sdtformatlock" xmlns:w16se="http://schemas.microsoft.com/office/word/2015/wordml/symex" xmlns:w16du="http://schemas.microsoft.com/office/word/2023/wordml/word16du" xmlns:wne="http://schemas.microsoft.com/office/word/2006/wordml" mc:Ignorable="w14 w15 w16se w16cid w16 w16cex w16sdtdh w16sdtfl cr w16du wp14">
+<w16cex:commentsExtensible xmlns:wpc="http://schemas.microsoft.com/office/word/2010/wordprocessingCanvas" xmlns:cx="http://schemas.microsoft.com/office/drawing/2014/chartex" xmlns:cx1="http://schemas.microsoft.com/office/drawing/2015/9/8/chartex" xmlns:cx2="http://schemas.microsoft.com/office/drawing/2015/10/21/chartex" xmlns:cx3="http://schemas.microsoft.com/office/drawing/2016/5/9/chartex" xmlns:cx4="http://schemas.microsoft.com/office/drawing/2016/5/10/chartex" xmlns:cx5="http://schemas.microsoft.com/office/drawing/2016/5/11/chartex" xmlns:cx6="http://schemas.microsoft.com/office/drawing/2016/5/12/chartex" xmlns:cx7="http://schemas.microsoft.com/office/drawing/2016/5/13/chartex" xmlns:cx8="http://schemas.microsoft.com/office/drawing/2016/5/14/chartex" xmlns:cr="http://schemas.microsoft.com/office/comments/2020/reactions" xmlns:mc="http://schemas.openxmlformats.org/markup-compatibility/2006" xmlns:aink="http://schemas.microsoft.com/office/drawing/2016/ink" xmlns:am3d="http://schemas.microsoft.com/office/drawing/2017/model3d" xmlns:o="urn:schemas-microsoft-com:office:office" xmlns:oel="http://schemas.microsoft.com/office/2019/extlst" xmlns:r="http://schemas.openxmlformats.org/officeDocument/2006/relationships" xmlns:m="http://schemas.openxmlformats.org/officeDocument/2006/math" xmlns:v="urn:schemas-microsoft-com:vml" xmlns:wp14="http://schemas.microsoft.com/office/word/2010/wordprocessingDrawing" xmlns:wp="http://schemas.openxmlformats.org/drawingml/2006/wordprocessingDrawing" xmlns:w10="urn:schemas-microsoft-com:office:word" xmlns:w="http://schemas.openxmlformats.org/wordprocessingml/2006/main" xmlns:w14="http://schemas.microsoft.com/office/word/2010/wordml" xmlns:w15="http://schemas.microsoft.com/office/word/2012/wordml" xmlns:w16cex="http://schemas.microsoft.com/office/word/2018/wordml/cex" xmlns:w16cid="http://schemas.microsoft.com/office/word/2016/wordml/cid" xmlns:w16="http://schemas.microsoft.com/office/word/2018/wordml" xmlns:w16du="http://schemas.microsoft.com/office/word/2023/wordml/word16du" xmlns:w16sdtdh="http://schemas.microsoft.com/office/word/2020/wordml/sdtdatahash" xmlns:w16sdtfl="http://schemas.microsoft.com/office/word/2024/wordml/sdtformatlock" xmlns:w16se="http://schemas.microsoft.com/office/word/2015/wordml/symex" xmlns:wpg="http://schemas.microsoft.com/office/word/2010/wordprocessingGroup" xmlns:wpi="http://schemas.microsoft.com/office/word/2010/wordprocessingInk" xmlns:wne="http://schemas.microsoft.com/office/word/2006/wordml" xmlns:wps="http://schemas.microsoft.com/office/word/2010/wordprocessingShape" mc:Ignorable="w14 w15 w16se w16cid w16 w16cex w16sdtdh w16sdtfl cr w16du wp14">
   <w16cex:commentExtensible w16cex:durableId="5C7A62BB" w16cex:dateUtc="2026-08-12T00:51:00Z"/>
   <w16cex:commentExtensible w16cex:durableId="28EADEDC" w16cex:dateUtc="2026-08-12T00:53:00Z"/>
   <w16cex:commentExtensible w16cex:durableId="3201A5F4" w16cex:dateUtc="2026-08-12T00:58:00Z"/>
@@ -1148,6 +1275,7 @@
   <w16cex:commentExtensible w16cex:durableId="4C49AE1E" w16cex:dateUtc="2026-08-12T01:07:00Z"/>
   <w16cex:commentExtensible w16cex:durableId="366EC05D" w16cex:dateUtc="2026-08-12T01:11:00Z"/>
   <w16cex:commentExtensible w16cex:durableId="22E3770A" w16cex:dateUtc="2026-08-12T01:11:00Z"/>
+  <w16cex:commentExtensible w16cex:durableId="479F6B2E" w16cex:dateUtc="2026-08-12T21:34:00Z"/>
   <w16cex:commentExtensible w16cex:durableId="62E2D218" w16cex:dateUtc="2026-08-12T02:51:00Z"/>
   <w16cex:commentExtensible w16cex:durableId="4B332354" w16cex:dateUtc="2026-08-12T03:09:00Z"/>
   <w16cex:commentExtensible w16cex:durableId="6DCCDFDD" w16cex:dateUtc="2026-08-12T03:36:00Z"/>
@@ -1155,7 +1283,7 @@
 </file>
 
 <file path=word/commentsIds.xml><?xml version="1.0" encoding="utf-8"?>
-<w16cid:commentsIds xmlns:wpc="http://schemas.microsoft.com/office/word/2010/wordprocessingCanvas" xmlns:cx="http://schemas.microsoft.com/office/drawing/2014/chartex" xmlns:cx1="http://schemas.microsoft.com/office/drawing/2015/9/8/chartex" xmlns:cx2="http://schemas.microsoft.com/office/drawing/2015/10/21/chartex" xmlns:cx3="http://schemas.microsoft.com/office/drawing/2016/5/9/chartex" xmlns:cx4="http://schemas.microsoft.com/office/drawing/2016/5/10/chartex" xmlns:cx5="http://schemas.microsoft.com/office/drawing/2016/5/11/chartex" xmlns:cx6="http://schemas.microsoft.com/office/drawing/2016/5/12/chartex" xmlns:cx7="http://schemas.microsoft.com/office/drawing/2016/5/13/chartex" xmlns:cx8="http://schemas.microsoft.com/office/drawing/2016/5/14/chartex" xmlns:mc="http://schemas.openxmlformats.org/markup-compatibility/2006" xmlns:m="http://schemas.openxmlformats.org/officeDocument/2006/math" xmlns:aink="http://schemas.microsoft.com/office/drawing/2016/ink" xmlns:am3d="http://schemas.microsoft.com/office/drawing/2017/model3d" xmlns:oel="http://schemas.microsoft.com/office/2019/extlst" xmlns:r="http://schemas.openxmlformats.org/officeDocument/2006/relationships" xmlns:wp14="http://schemas.microsoft.com/office/word/2010/wordprocessingDrawing" xmlns:wp="http://schemas.openxmlformats.org/drawingml/2006/wordprocessingDrawing" xmlns:wpg="http://schemas.microsoft.com/office/word/2010/wordprocessingGroup" xmlns:wpi="http://schemas.microsoft.com/office/word/2010/wordprocessingInk" xmlns:wps="http://schemas.microsoft.com/office/word/2010/wordprocessingShape" xmlns:o="urn:schemas-microsoft-com:office:office" xmlns:v="urn:schemas-microsoft-com:vml" xmlns:w10="urn:schemas-microsoft-com:office:word" xmlns:w="http://schemas.openxmlformats.org/wordprocessingml/2006/main" xmlns:w14="http://schemas.microsoft.com/office/word/2010/wordml" xmlns:w15="http://schemas.microsoft.com/office/word/2012/wordml" xmlns:w16cei="http://schemas.microsoft.com/office/word/2026/wordml/cei" xmlns:w16cex="http://schemas.microsoft.com/office/word/2018/wordml/cex" xmlns:w16cid="http://schemas.microsoft.com/office/word/2016/wordml/cid" xmlns:w16="http://schemas.microsoft.com/office/word/2018/wordml" xmlns:w16sdtdh="http://schemas.microsoft.com/office/word/2020/wordml/sdtdatahash" xmlns:w16sdtfl="http://schemas.microsoft.com/office/word/2024/wordml/sdtformatlock" xmlns:w16se="http://schemas.microsoft.com/office/word/2015/wordml/symex" xmlns:w16du="http://schemas.microsoft.com/office/word/2023/wordml/word16du" xmlns:wne="http://schemas.microsoft.com/office/word/2006/wordml" mc:Ignorable="w14 w15 w16se w16cid w16 w16cex w16sdtdh w16sdtfl w16du wp14">
+<w16cid:commentsIds xmlns:wpc="http://schemas.microsoft.com/office/word/2010/wordprocessingCanvas" xmlns:cx="http://schemas.microsoft.com/office/drawing/2014/chartex" xmlns:cx1="http://schemas.microsoft.com/office/drawing/2015/9/8/chartex" xmlns:cx2="http://schemas.microsoft.com/office/drawing/2015/10/21/chartex" xmlns:cx3="http://schemas.microsoft.com/office/drawing/2016/5/9/chartex" xmlns:cx4="http://schemas.microsoft.com/office/drawing/2016/5/10/chartex" xmlns:cx5="http://schemas.microsoft.com/office/drawing/2016/5/11/chartex" xmlns:cx6="http://schemas.microsoft.com/office/drawing/2016/5/12/chartex" xmlns:cx7="http://schemas.microsoft.com/office/drawing/2016/5/13/chartex" xmlns:cx8="http://schemas.microsoft.com/office/drawing/2016/5/14/chartex" xmlns:mc="http://schemas.openxmlformats.org/markup-compatibility/2006" xmlns:aink="http://schemas.microsoft.com/office/drawing/2016/ink" xmlns:am3d="http://schemas.microsoft.com/office/drawing/2017/model3d" xmlns:o="urn:schemas-microsoft-com:office:office" xmlns:oel="http://schemas.microsoft.com/office/2019/extlst" xmlns:r="http://schemas.openxmlformats.org/officeDocument/2006/relationships" xmlns:m="http://schemas.openxmlformats.org/officeDocument/2006/math" xmlns:v="urn:schemas-microsoft-com:vml" xmlns:wp14="http://schemas.microsoft.com/office/word/2010/wordprocessingDrawing" xmlns:wp="http://schemas.openxmlformats.org/drawingml/2006/wordprocessingDrawing" xmlns:w10="urn:schemas-microsoft-com:office:word" xmlns:w="http://schemas.openxmlformats.org/wordprocessingml/2006/main" xmlns:w14="http://schemas.microsoft.com/office/word/2010/wordml" xmlns:w15="http://schemas.microsoft.com/office/word/2012/wordml" xmlns:w16cex="http://schemas.microsoft.com/office/word/2018/wordml/cex" xmlns:w16cid="http://schemas.microsoft.com/office/word/2016/wordml/cid" xmlns:w16="http://schemas.microsoft.com/office/word/2018/wordml" xmlns:w16du="http://schemas.microsoft.com/office/word/2023/wordml/word16du" xmlns:w16sdtdh="http://schemas.microsoft.com/office/word/2020/wordml/sdtdatahash" xmlns:w16sdtfl="http://schemas.microsoft.com/office/word/2024/wordml/sdtformatlock" xmlns:w16se="http://schemas.microsoft.com/office/word/2015/wordml/symex" xmlns:wpg="http://schemas.microsoft.com/office/word/2010/wordprocessingGroup" xmlns:wpi="http://schemas.microsoft.com/office/word/2010/wordprocessingInk" xmlns:wne="http://schemas.microsoft.com/office/word/2006/wordml" xmlns:wps="http://schemas.microsoft.com/office/word/2010/wordprocessingShape" mc:Ignorable="w14 w15 w16se w16cid w16 w16cex w16sdtdh w16sdtfl w16du wp14">
   <w16cid:commentId w16cid:paraId="6A349BC9" w16cid:durableId="5C7A62BB"/>
   <w16cid:commentId w16cid:paraId="0ED81B75" w16cid:durableId="28EADEDC"/>
   <w16cid:commentId w16cid:paraId="763FAF6B" w16cid:durableId="3201A5F4"/>
@@ -1164,6 +1292,7 @@
   <w16cid:commentId w16cid:paraId="4B8ADC60" w16cid:durableId="4C49AE1E"/>
   <w16cid:commentId w16cid:paraId="23BFEBAB" w16cid:durableId="366EC05D"/>
   <w16cid:commentId w16cid:paraId="7A5B5686" w16cid:durableId="22E3770A"/>
+  <w16cid:commentId w16cid:paraId="320DC1CD" w16cid:durableId="479F6B2E"/>
   <w16cid:commentId w16cid:paraId="7A22DF8A" w16cid:durableId="62E2D218"/>
   <w16cid:commentId w16cid:paraId="36AAE7A0" w16cid:durableId="4B332354"/>
   <w16cid:commentId w16cid:paraId="1E52ED40" w16cid:durableId="6DCCDFDD"/>
@@ -1171,7 +1300,7 @@
 </file>
 
 <file path=word/numbering.xml><?xml version="1.0" encoding="utf-8"?>
-<w:numbering xmlns:wpc="http://schemas.microsoft.com/office/word/2010/wordprocessingCanvas" xmlns:cx="http://schemas.microsoft.com/office/drawing/2014/chartex" xmlns:cx1="http://schemas.microsoft.com/office/drawing/2015/9/8/chartex" xmlns:cx2="http://schemas.microsoft.com/office/drawing/2015/10/21/chartex" xmlns:cx3="http://schemas.microsoft.com/office/drawing/2016/5/9/chartex" xmlns:cx4="http://schemas.microsoft.com/office/drawing/2016/5/10/chartex" xmlns:cx5="http://schemas.microsoft.com/office/drawing/2016/5/11/chartex" xmlns:cx6="http://schemas.microsoft.com/office/drawing/2016/5/12/chartex" xmlns:cx7="http://schemas.microsoft.com/office/drawing/2016/5/13/chartex" xmlns:cx8="http://schemas.microsoft.com/office/drawing/2016/5/14/chartex" xmlns:mc="http://schemas.openxmlformats.org/markup-compatibility/2006" xmlns:m="http://schemas.openxmlformats.org/officeDocument/2006/math" xmlns:aink="http://schemas.microsoft.com/office/drawing/2016/ink" xmlns:am3d="http://schemas.microsoft.com/office/drawing/2017/model3d" xmlns:oel="http://schemas.microsoft.com/office/2019/extlst" xmlns:r="http://schemas.openxmlformats.org/officeDocument/2006/relationships" xmlns:wp14="http://schemas.microsoft.com/office/word/2010/wordprocessingDrawing" xmlns:wp="http://schemas.openxmlformats.org/drawingml/2006/wordprocessingDrawing" xmlns:wpg="http://schemas.microsoft.com/office/word/2010/wordprocessingGroup" xmlns:wpi="http://schemas.microsoft.com/office/word/2010/wordprocessingInk" xmlns:wps="http://schemas.microsoft.com/office/word/2010/wordprocessingShape" xmlns:o="urn:schemas-microsoft-com:office:office" xmlns:v="urn:schemas-microsoft-com:vml" xmlns:w10="urn:schemas-microsoft-com:office:word" xmlns:w="http://schemas.openxmlformats.org/wordprocessingml/2006/main" xmlns:w14="http://schemas.microsoft.com/office/word/2010/wordml" xmlns:w15="http://schemas.microsoft.com/office/word/2012/wordml" xmlns:w16cei="http://schemas.microsoft.com/office/word/2026/wordml/cei" xmlns:w16cex="http://schemas.microsoft.com/office/word/2018/wordml/cex" xmlns:w16cid="http://schemas.microsoft.com/office/word/2016/wordml/cid" xmlns:w16="http://schemas.microsoft.com/office/word/2018/wordml" xmlns:w16sdtdh="http://schemas.microsoft.com/office/word/2020/wordml/sdtdatahash" xmlns:w16sdtfl="http://schemas.microsoft.com/office/word/2024/wordml/sdtformatlock" xmlns:w16se="http://schemas.microsoft.com/office/word/2015/wordml/symex" xmlns:w16du="http://schemas.microsoft.com/office/word/2023/wordml/word16du" xmlns:wne="http://schemas.microsoft.com/office/word/2006/wordml" mc:Ignorable="w14 w15 w16se w16cid w16 w16cex w16sdtdh w16sdtfl w16du wp14">
+<w:numbering xmlns:wpc="http://schemas.microsoft.com/office/word/2010/wordprocessingCanvas" xmlns:cx="http://schemas.microsoft.com/office/drawing/2014/chartex" xmlns:cx1="http://schemas.microsoft.com/office/drawing/2015/9/8/chartex" xmlns:cx2="http://schemas.microsoft.com/office/drawing/2015/10/21/chartex" xmlns:cx3="http://schemas.microsoft.com/office/drawing/2016/5/9/chartex" xmlns:cx4="http://schemas.microsoft.com/office/drawing/2016/5/10/chartex" xmlns:cx5="http://schemas.microsoft.com/office/drawing/2016/5/11/chartex" xmlns:cx6="http://schemas.microsoft.com/office/drawing/2016/5/12/chartex" xmlns:cx7="http://schemas.microsoft.com/office/drawing/2016/5/13/chartex" xmlns:cx8="http://schemas.microsoft.com/office/drawing/2016/5/14/chartex" xmlns:mc="http://schemas.openxmlformats.org/markup-compatibility/2006" xmlns:aink="http://schemas.microsoft.com/office/drawing/2016/ink" xmlns:am3d="http://schemas.microsoft.com/office/drawing/2017/model3d" xmlns:o="urn:schemas-microsoft-com:office:office" xmlns:oel="http://schemas.microsoft.com/office/2019/extlst" xmlns:r="http://schemas.openxmlformats.org/officeDocument/2006/relationships" xmlns:m="http://schemas.openxmlformats.org/officeDocument/2006/math" xmlns:v="urn:schemas-microsoft-com:vml" xmlns:wp14="http://schemas.microsoft.com/office/word/2010/wordprocessingDrawing" xmlns:wp="http://schemas.openxmlformats.org/drawingml/2006/wordprocessingDrawing" xmlns:w10="urn:schemas-microsoft-com:office:word" xmlns:w="http://schemas.openxmlformats.org/wordprocessingml/2006/main" xmlns:w14="http://schemas.microsoft.com/office/word/2010/wordml" xmlns:w15="http://schemas.microsoft.com/office/word/2012/wordml" xmlns:w16cex="http://schemas.microsoft.com/office/word/2018/wordml/cex" xmlns:w16cid="http://schemas.microsoft.com/office/word/2016/wordml/cid" xmlns:w16="http://schemas.microsoft.com/office/word/2018/wordml" xmlns:w16du="http://schemas.microsoft.com/office/word/2023/wordml/word16du" xmlns:w16sdtdh="http://schemas.microsoft.com/office/word/2020/wordml/sdtdatahash" xmlns:w16sdtfl="http://schemas.microsoft.com/office/word/2024/wordml/sdtformatlock" xmlns:w16se="http://schemas.microsoft.com/office/word/2015/wordml/symex" xmlns:wpg="http://schemas.microsoft.com/office/word/2010/wordprocessingGroup" xmlns:wpi="http://schemas.microsoft.com/office/word/2010/wordprocessingInk" xmlns:wne="http://schemas.microsoft.com/office/word/2006/wordml" xmlns:wps="http://schemas.microsoft.com/office/word/2010/wordprocessingShape" mc:Ignorable="w14 w15 w16se w16cid w16 w16cex w16sdtdh w16sdtfl w16du wp14">
   <w:abstractNum w:abstractNumId="0" w15:restartNumberingAfterBreak="0">
     <w:nsid w:val="22D6192B"/>
     <w:multiLevelType w:val="hybridMultilevel"/>
@@ -1444,7 +1573,7 @@
       <w:lvlText w:val=""/>
       <w:lvlJc w:val="left"/>
       <w:pPr>
-        <w:ind w:left="720" w:hanging="360"/>
+        <w:ind w:left="1080" w:hanging="360"/>
       </w:pPr>
       <w:rPr>
         <w:rFonts w:ascii="Symbol" w:hAnsi="Symbol" w:hint="default"/>
@@ -1456,7 +1585,7 @@
       <w:lvlText w:val="o"/>
       <w:lvlJc w:val="left"/>
       <w:pPr>
-        <w:ind w:left="1440" w:hanging="360"/>
+        <w:ind w:left="1800" w:hanging="360"/>
       </w:pPr>
       <w:rPr>
         <w:rFonts w:ascii="Courier New" w:hAnsi="Courier New" w:cs="Courier New" w:hint="default"/>
@@ -1468,7 +1597,7 @@
       <w:lvlText w:val=""/>
       <w:lvlJc w:val="left"/>
       <w:pPr>
-        <w:ind w:left="2160" w:hanging="360"/>
+        <w:ind w:left="2520" w:hanging="360"/>
       </w:pPr>
       <w:rPr>
         <w:rFonts w:ascii="Wingdings" w:hAnsi="Wingdings" w:hint="default"/>
@@ -1480,7 +1609,7 @@
       <w:lvlText w:val=""/>
       <w:lvlJc w:val="left"/>
       <w:pPr>
-        <w:ind w:left="2880" w:hanging="360"/>
+        <w:ind w:left="3240" w:hanging="360"/>
       </w:pPr>
       <w:rPr>
         <w:rFonts w:ascii="Symbol" w:hAnsi="Symbol" w:hint="default"/>
@@ -1492,7 +1621,7 @@
       <w:lvlText w:val="o"/>
       <w:lvlJc w:val="left"/>
       <w:pPr>
-        <w:ind w:left="3600" w:hanging="360"/>
+        <w:ind w:left="3960" w:hanging="360"/>
       </w:pPr>
       <w:rPr>
         <w:rFonts w:ascii="Courier New" w:hAnsi="Courier New" w:cs="Courier New" w:hint="default"/>
@@ -1504,7 +1633,7 @@
       <w:lvlText w:val=""/>
       <w:lvlJc w:val="left"/>
       <w:pPr>
-        <w:ind w:left="4320" w:hanging="360"/>
+        <w:ind w:left="4680" w:hanging="360"/>
       </w:pPr>
       <w:rPr>
         <w:rFonts w:ascii="Wingdings" w:hAnsi="Wingdings" w:hint="default"/>
@@ -1516,7 +1645,7 @@
       <w:lvlText w:val=""/>
       <w:lvlJc w:val="left"/>
       <w:pPr>
-        <w:ind w:left="5040" w:hanging="360"/>
+        <w:ind w:left="5400" w:hanging="360"/>
       </w:pPr>
       <w:rPr>
         <w:rFonts w:ascii="Symbol" w:hAnsi="Symbol" w:hint="default"/>
@@ -1528,7 +1657,7 @@
       <w:lvlText w:val="o"/>
       <w:lvlJc w:val="left"/>
       <w:pPr>
-        <w:ind w:left="5760" w:hanging="360"/>
+        <w:ind w:left="6120" w:hanging="360"/>
       </w:pPr>
       <w:rPr>
         <w:rFonts w:ascii="Courier New" w:hAnsi="Courier New" w:cs="Courier New" w:hint="default"/>
@@ -1540,7 +1669,7 @@
       <w:lvlText w:val=""/>
       <w:lvlJc w:val="left"/>
       <w:pPr>
-        <w:ind w:left="6480" w:hanging="360"/>
+        <w:ind w:left="6840" w:hanging="360"/>
       </w:pPr>
       <w:rPr>
         <w:rFonts w:ascii="Wingdings" w:hAnsi="Wingdings" w:hint="default"/>
@@ -1980,7 +2109,7 @@
 </file>
 
 <file path=word/people.xml><?xml version="1.0" encoding="utf-8"?>
-<w15:people xmlns:wpc="http://schemas.microsoft.com/office/word/2010/wordprocessingCanvas" xmlns:cx="http://schemas.microsoft.com/office/drawing/2014/chartex" xmlns:cx1="http://schemas.microsoft.com/office/drawing/2015/9/8/chartex" xmlns:cx2="http://schemas.microsoft.com/office/drawing/2015/10/21/chartex" xmlns:cx3="http://schemas.microsoft.com/office/drawing/2016/5/9/chartex" xmlns:cx4="http://schemas.microsoft.com/office/drawing/2016/5/10/chartex" xmlns:cx5="http://schemas.microsoft.com/office/drawing/2016/5/11/chartex" xmlns:cx6="http://schemas.microsoft.com/office/drawing/2016/5/12/chartex" xmlns:cx7="http://schemas.microsoft.com/office/drawing/2016/5/13/chartex" xmlns:cx8="http://schemas.microsoft.com/office/drawing/2016/5/14/chartex" xmlns:mc="http://schemas.openxmlformats.org/markup-compatibility/2006" xmlns:m="http://schemas.openxmlformats.org/officeDocument/2006/math" xmlns:aink="http://schemas.microsoft.com/office/drawing/2016/ink" xmlns:am3d="http://schemas.microsoft.com/office/drawing/2017/model3d" xmlns:oel="http://schemas.microsoft.com/office/2019/extlst" xmlns:r="http://schemas.openxmlformats.org/officeDocument/2006/relationships" xmlns:wp14="http://schemas.microsoft.com/office/word/2010/wordprocessingDrawing" xmlns:wp="http://schemas.openxmlformats.org/drawingml/2006/wordprocessingDrawing" xmlns:wpg="http://schemas.microsoft.com/office/word/2010/wordprocessingGroup" xmlns:wpi="http://schemas.microsoft.com/office/word/2010/wordprocessingInk" xmlns:wps="http://schemas.microsoft.com/office/word/2010/wordprocessingShape" xmlns:o="urn:schemas-microsoft-com:office:office" xmlns:v="urn:schemas-microsoft-com:vml" xmlns:w10="urn:schemas-microsoft-com:office:word" xmlns:w="http://schemas.openxmlformats.org/wordprocessingml/2006/main" xmlns:w14="http://schemas.microsoft.com/office/word/2010/wordml" xmlns:w15="http://schemas.microsoft.com/office/word/2012/wordml" xmlns:w16cei="http://schemas.microsoft.com/office/word/2026/wordml/cei" xmlns:w16cex="http://schemas.microsoft.com/office/word/2018/wordml/cex" xmlns:w16cid="http://schemas.microsoft.com/office/word/2016/wordml/cid" xmlns:w16="http://schemas.microsoft.com/office/word/2018/wordml" xmlns:w16sdtdh="http://schemas.microsoft.com/office/word/2020/wordml/sdtdatahash" xmlns:w16sdtfl="http://schemas.microsoft.com/office/word/2024/wordml/sdtformatlock" xmlns:w16se="http://schemas.microsoft.com/office/word/2015/wordml/symex" xmlns:w16du="http://schemas.microsoft.com/office/word/2023/wordml/word16du" xmlns:wne="http://schemas.microsoft.com/office/word/2006/wordml" mc:Ignorable="w14 w15 w16se w16cid w16 w16cex w16sdtdh w16sdtfl w16du wp14">
+<w15:people xmlns:wpc="http://schemas.microsoft.com/office/word/2010/wordprocessingCanvas" xmlns:cx="http://schemas.microsoft.com/office/drawing/2014/chartex" xmlns:cx1="http://schemas.microsoft.com/office/drawing/2015/9/8/chartex" xmlns:cx2="http://schemas.microsoft.com/office/drawing/2015/10/21/chartex" xmlns:cx3="http://schemas.microsoft.com/office/drawing/2016/5/9/chartex" xmlns:cx4="http://schemas.microsoft.com/office/drawing/2016/5/10/chartex" xmlns:cx5="http://schemas.microsoft.com/office/drawing/2016/5/11/chartex" xmlns:cx6="http://schemas.microsoft.com/office/drawing/2016/5/12/chartex" xmlns:cx7="http://schemas.microsoft.com/office/drawing/2016/5/13/chartex" xmlns:cx8="http://schemas.microsoft.com/office/drawing/2016/5/14/chartex" xmlns:mc="http://schemas.openxmlformats.org/markup-compatibility/2006" xmlns:aink="http://schemas.microsoft.com/office/drawing/2016/ink" xmlns:am3d="http://schemas.microsoft.com/office/drawing/2017/model3d" xmlns:o="urn:schemas-microsoft-com:office:office" xmlns:oel="http://schemas.microsoft.com/office/2019/extlst" xmlns:r="http://schemas.openxmlformats.org/officeDocument/2006/relationships" xmlns:m="http://schemas.openxmlformats.org/officeDocument/2006/math" xmlns:v="urn:schemas-microsoft-com:vml" xmlns:wp14="http://schemas.microsoft.com/office/word/2010/wordprocessingDrawing" xmlns:wp="http://schemas.openxmlformats.org/drawingml/2006/wordprocessingDrawing" xmlns:w10="urn:schemas-microsoft-com:office:word" xmlns:w="http://schemas.openxmlformats.org/wordprocessingml/2006/main" xmlns:w14="http://schemas.microsoft.com/office/word/2010/wordml" xmlns:w15="http://schemas.microsoft.com/office/word/2012/wordml" xmlns:w16cex="http://schemas.microsoft.com/office/word/2018/wordml/cex" xmlns:w16cid="http://schemas.microsoft.com/office/word/2016/wordml/cid" xmlns:w16="http://schemas.microsoft.com/office/word/2018/wordml" xmlns:w16du="http://schemas.microsoft.com/office/word/2023/wordml/word16du" xmlns:w16sdtdh="http://schemas.microsoft.com/office/word/2020/wordml/sdtdatahash" xmlns:w16sdtfl="http://schemas.microsoft.com/office/word/2024/wordml/sdtformatlock" xmlns:w16se="http://schemas.microsoft.com/office/word/2015/wordml/symex" xmlns:wpg="http://schemas.microsoft.com/office/word/2010/wordprocessingGroup" xmlns:wpi="http://schemas.microsoft.com/office/word/2010/wordprocessingInk" xmlns:wne="http://schemas.microsoft.com/office/word/2006/wordml" xmlns:wps="http://schemas.microsoft.com/office/word/2010/wordprocessingShape" mc:Ignorable="w14 w15 w16se w16cid w16 w16cex w16sdtdh w16sdtfl w16du wp14">
   <w15:person w15:author="Liam Degand">
     <w15:presenceInfo w15:providerId="AD" w15:userId="S::liamdegand@uvic.ca::1aacccb9-fb0e-4e4e-89df-6607ea601c1f"/>
   </w15:person>
@@ -1991,7 +2120,7 @@
 </file>
 
 <file path=word/styles.xml><?xml version="1.0" encoding="utf-8"?>
-<w:styles xmlns:mc="http://schemas.openxmlformats.org/markup-compatibility/2006" xmlns:r="http://schemas.openxmlformats.org/officeDocument/2006/relationships" xmlns:w="http://schemas.openxmlformats.org/wordprocessingml/2006/main" xmlns:w14="http://schemas.microsoft.com/office/word/2010/wordml" xmlns:w15="http://schemas.microsoft.com/office/word/2012/wordml" xmlns:w16cex="http://schemas.microsoft.com/office/word/2018/wordml/cex" xmlns:w16cid="http://schemas.microsoft.com/office/word/2016/wordml/cid" xmlns:w16="http://schemas.microsoft.com/office/word/2018/wordml" xmlns:w16sdtdh="http://schemas.microsoft.com/office/word/2020/wordml/sdtdatahash" xmlns:w16sdtfl="http://schemas.microsoft.com/office/word/2024/wordml/sdtformatlock" xmlns:w16se="http://schemas.microsoft.com/office/word/2015/wordml/symex" xmlns:w16du="http://schemas.microsoft.com/office/word/2023/wordml/word16du" mc:Ignorable="w14 w15 w16se w16cid w16 w16cex w16sdtdh w16sdtfl w16du">
+<w:styles xmlns:mc="http://schemas.openxmlformats.org/markup-compatibility/2006" xmlns:r="http://schemas.openxmlformats.org/officeDocument/2006/relationships" xmlns:w="http://schemas.openxmlformats.org/wordprocessingml/2006/main" xmlns:w14="http://schemas.microsoft.com/office/word/2010/wordml" xmlns:w15="http://schemas.microsoft.com/office/word/2012/wordml" xmlns:w16cex="http://schemas.microsoft.com/office/word/2018/wordml/cex" xmlns:w16cid="http://schemas.microsoft.com/office/word/2016/wordml/cid" xmlns:w16="http://schemas.microsoft.com/office/word/2018/wordml" xmlns:w16du="http://schemas.microsoft.com/office/word/2023/wordml/word16du" xmlns:w16sdtdh="http://schemas.microsoft.com/office/word/2020/wordml/sdtdatahash" xmlns:w16sdtfl="http://schemas.microsoft.com/office/word/2024/wordml/sdtformatlock" xmlns:w16se="http://schemas.microsoft.com/office/word/2015/wordml/symex" mc:Ignorable="w14 w15 w16se w16cid w16 w16cex w16sdtdh w16sdtfl w16du">
   <w:docDefaults>
     <w:rPrDefault>
       <w:rPr>
@@ -2592,6 +2721,7 @@
   <w:style w:type="character" w:default="1" w:styleId="DefaultParagraphFont">
     <w:name w:val="Default Paragraph Font"/>
     <w:uiPriority w:val="1"/>
+    <w:semiHidden/>
     <w:unhideWhenUsed/>
   </w:style>
   <w:style w:type="table" w:default="1" w:styleId="TableNormal">
@@ -2991,6 +3121,18 @@
       <w:bCs/>
       <w:sz w:val="20"/>
       <w:szCs w:val="20"/>
+    </w:rPr>
+  </w:style>
+  <w:style w:type="character" w:styleId="FollowedHyperlink">
+    <w:name w:val="FollowedHyperlink"/>
+    <w:basedOn w:val="DefaultParagraphFont"/>
+    <w:uiPriority w:val="99"/>
+    <w:semiHidden/>
+    <w:unhideWhenUsed/>
+    <w:rsid w:val="00E96CE2"/>
+    <w:rPr>
+      <w:color w:val="96607D" w:themeColor="followedHyperlink"/>
+      <w:u w:val="single"/>
     </w:rPr>
   </w:style>
 </w:styles>

</xml_diff>